<commit_message>
dodanie pytania o to co robią kregi?
</commit_message>
<xml_diff>
--- a/Azramata_FAQ_DO_WERYFIKACJI.docx
+++ b/Azramata_FAQ_DO_WERYFIKACJI.docx
@@ -1922,7 +1922,7 @@
     <w:p>
       <w:r>
         <w:pict w14:anchorId="0D287544">
-          <v:rect id="_x0000_i1121" style="width:0;height:1.5pt" o:hralign="center" o:hrstd="t" o:hr="t" fillcolor="#a0a0a0" stroked="f"/>
+          <v:rect id="_x0000_i1025" style="width:0;height:1.5pt" o:hralign="center" o:hrstd="t" o:hr="t" fillcolor="#a0a0a0" stroked="f"/>
         </w:pict>
       </w:r>
     </w:p>
@@ -1965,7 +1965,7 @@
     <w:p>
       <w:r>
         <w:pict w14:anchorId="56D46235">
-          <v:rect id="_x0000_i1123" style="width:0;height:1.5pt" o:hralign="center" o:hrstd="t" o:hr="t" fillcolor="#a0a0a0" stroked="f"/>
+          <v:rect id="_x0000_i1026" style="width:0;height:1.5pt" o:hralign="center" o:hrstd="t" o:hr="t" fillcolor="#a0a0a0" stroked="f"/>
         </w:pict>
       </w:r>
     </w:p>
@@ -2019,7 +2019,7 @@
     <w:p>
       <w:r>
         <w:pict w14:anchorId="2CC87F9E">
-          <v:rect id="_x0000_i1124" style="width:0;height:1.5pt" o:hralign="center" o:hrstd="t" o:hr="t" fillcolor="#a0a0a0" stroked="f"/>
+          <v:rect id="_x0000_i1027" style="width:0;height:1.5pt" o:hralign="center" o:hrstd="t" o:hr="t" fillcolor="#a0a0a0" stroked="f"/>
         </w:pict>
       </w:r>
     </w:p>
@@ -2071,7 +2071,7 @@
     <w:p>
       <w:r>
         <w:pict w14:anchorId="22D4AD9D">
-          <v:rect id="_x0000_i1125" style="width:0;height:1.5pt" o:hralign="center" o:hrstd="t" o:hr="t" fillcolor="#a0a0a0" stroked="f"/>
+          <v:rect id="_x0000_i1028" style="width:0;height:1.5pt" o:hralign="center" o:hrstd="t" o:hr="t" fillcolor="#a0a0a0" stroked="f"/>
         </w:pict>
       </w:r>
     </w:p>
@@ -2114,7 +2114,7 @@
     <w:p>
       <w:r>
         <w:pict w14:anchorId="54151203">
-          <v:rect id="_x0000_i1126" style="width:0;height:1.5pt" o:hralign="center" o:hrstd="t" o:hr="t" fillcolor="#a0a0a0" stroked="f"/>
+          <v:rect id="_x0000_i1029" style="width:0;height:1.5pt" o:hralign="center" o:hrstd="t" o:hr="t" fillcolor="#a0a0a0" stroked="f"/>
         </w:pict>
       </w:r>
     </w:p>
@@ -2166,7 +2166,7 @@
     <w:p>
       <w:r>
         <w:pict w14:anchorId="4760DCD9">
-          <v:rect id="_x0000_i1127" style="width:0;height:1.5pt" o:hralign="center" o:hrstd="t" o:hr="t" fillcolor="#a0a0a0" stroked="f"/>
+          <v:rect id="_x0000_i1030" style="width:0;height:1.5pt" o:hralign="center" o:hrstd="t" o:hr="t" fillcolor="#a0a0a0" stroked="f"/>
         </w:pict>
       </w:r>
     </w:p>
@@ -2217,7 +2217,7 @@
     <w:p>
       <w:r>
         <w:pict w14:anchorId="6A054FEA">
-          <v:rect id="_x0000_i1128" style="width:0;height:1.5pt" o:hralign="center" o:hrstd="t" o:hr="t" fillcolor="#a0a0a0" stroked="f"/>
+          <v:rect id="_x0000_i1031" style="width:0;height:1.5pt" o:hralign="center" o:hrstd="t" o:hr="t" fillcolor="#a0a0a0" stroked="f"/>
         </w:pict>
       </w:r>
     </w:p>
@@ -2260,7 +2260,7 @@
     <w:p>
       <w:r>
         <w:pict w14:anchorId="68D7B11A">
-          <v:rect id="_x0000_i1129" style="width:0;height:1.5pt" o:hralign="center" o:hrstd="t" o:hr="t" fillcolor="#a0a0a0" stroked="f"/>
+          <v:rect id="_x0000_i1032" style="width:0;height:1.5pt" o:hralign="center" o:hrstd="t" o:hr="t" fillcolor="#a0a0a0" stroked="f"/>
         </w:pict>
       </w:r>
     </w:p>
@@ -2295,7 +2295,7 @@
     <w:p>
       <w:r>
         <w:pict w14:anchorId="35B21E45">
-          <v:rect id="_x0000_i1130" style="width:0;height:1.5pt" o:hralign="center" o:hrstd="t" o:hr="t" fillcolor="#a0a0a0" stroked="f"/>
+          <v:rect id="_x0000_i1033" style="width:0;height:1.5pt" o:hralign="center" o:hrstd="t" o:hr="t" fillcolor="#a0a0a0" stroked="f"/>
         </w:pict>
       </w:r>
     </w:p>
@@ -2344,7 +2344,7 @@
     <w:p>
       <w:r>
         <w:pict w14:anchorId="0D3FFF28">
-          <v:rect id="_x0000_i1131" style="width:0;height:1.5pt" o:hralign="center" o:hrstd="t" o:hr="t" fillcolor="#a0a0a0" stroked="f"/>
+          <v:rect id="_x0000_i1034" style="width:0;height:1.5pt" o:hralign="center" o:hrstd="t" o:hr="t" fillcolor="#a0a0a0" stroked="f"/>
         </w:pict>
       </w:r>
     </w:p>
@@ -2387,7 +2387,7 @@
     <w:p>
       <w:r>
         <w:pict w14:anchorId="6B2C5CF2">
-          <v:rect id="_x0000_i1132" style="width:0;height:1.5pt" o:hralign="center" o:hrstd="t" o:hr="t" fillcolor="#a0a0a0" stroked="f"/>
+          <v:rect id="_x0000_i1035" style="width:0;height:1.5pt" o:hralign="center" o:hrstd="t" o:hr="t" fillcolor="#a0a0a0" stroked="f"/>
         </w:pict>
       </w:r>
     </w:p>
@@ -2438,7 +2438,7 @@
     <w:p>
       <w:r>
         <w:pict w14:anchorId="1FF6B1B1">
-          <v:rect id="_x0000_i1133" style="width:0;height:1.5pt" o:hralign="center" o:hrstd="t" o:hr="t" fillcolor="#a0a0a0" stroked="f"/>
+          <v:rect id="_x0000_i1036" style="width:0;height:1.5pt" o:hralign="center" o:hrstd="t" o:hr="t" fillcolor="#a0a0a0" stroked="f"/>
         </w:pict>
       </w:r>
     </w:p>
@@ -2482,7 +2482,7 @@
     <w:p>
       <w:r>
         <w:pict w14:anchorId="560B9DDA">
-          <v:rect id="_x0000_i1134" style="width:0;height:1.5pt" o:hralign="center" o:hrstd="t" o:hr="t" fillcolor="#a0a0a0" stroked="f"/>
+          <v:rect id="_x0000_i1037" style="width:0;height:1.5pt" o:hralign="center" o:hrstd="t" o:hr="t" fillcolor="#a0a0a0" stroked="f"/>
         </w:pict>
       </w:r>
     </w:p>
@@ -2517,7 +2517,7 @@
     <w:p>
       <w:r>
         <w:pict w14:anchorId="16B3AA23">
-          <v:rect id="_x0000_i1135" style="width:0;height:1.5pt" o:hralign="center" o:hrstd="t" o:hr="t" fillcolor="#a0a0a0" stroked="f"/>
+          <v:rect id="_x0000_i1038" style="width:0;height:1.5pt" o:hralign="center" o:hrstd="t" o:hr="t" fillcolor="#a0a0a0" stroked="f"/>
         </w:pict>
       </w:r>
     </w:p>
@@ -2561,7 +2561,7 @@
     <w:p>
       <w:r>
         <w:pict w14:anchorId="0592B073">
-          <v:rect id="_x0000_i1136" style="width:0;height:1.5pt" o:hralign="center" o:hrstd="t" o:hr="t" fillcolor="#a0a0a0" stroked="f"/>
+          <v:rect id="_x0000_i1039" style="width:0;height:1.5pt" o:hralign="center" o:hrstd="t" o:hr="t" fillcolor="#a0a0a0" stroked="f"/>
         </w:pict>
       </w:r>
     </w:p>
@@ -2601,7 +2601,64 @@
         <w:t>?”</w:t>
       </w:r>
     </w:p>
-    <w:p/>
+    <w:p>
+      <w:pPr>
+        <w:pStyle w:val="Nagwek2"/>
+      </w:pPr>
+      <w:r>
+        <w:t>64. Co robią tzw. Kręgi?</w:t>
+      </w:r>
+    </w:p>
+    <w:p>
+      <w:pPr>
+        <w:spacing w:after="0"/>
+      </w:pPr>
+      <w:r>
+        <w:t>Kręgi porządkują percepcję.</w:t>
+      </w:r>
+      <w:r>
+        <w:br/>
+        <w:t>Uporządkowana percepcja obniża stres.</w:t>
+      </w:r>
+      <w:r>
+        <w:br/>
+        <w:t>Obniżony stres wpływa na regulację psychofizyczną.</w:t>
+      </w:r>
+      <w:r>
+        <w:br/>
+        <w:t xml:space="preserve">Ale </w:t>
+      </w:r>
+      <w:proofErr w:type="spellStart"/>
+      <w:r>
+        <w:t>Azramata</w:t>
+      </w:r>
+      <w:proofErr w:type="spellEnd"/>
+      <w:r>
+        <w:t xml:space="preserve"> nie ingeruje w ciało</w:t>
+      </w:r>
+      <w:r>
+        <w:t xml:space="preserve">, </w:t>
+      </w:r>
+    </w:p>
+    <w:p>
+      <w:pPr>
+        <w:spacing w:after="0"/>
+      </w:pPr>
+      <w:r>
+        <w:t>tylko bezpośrednio w świadomość</w:t>
+      </w:r>
+      <w:r>
+        <w:t>.</w:t>
+      </w:r>
+    </w:p>
+    <w:p>
+      <w:pPr>
+        <w:spacing w:after="0"/>
+      </w:pPr>
+      <w:r>
+        <w:t>Rośnie świadomość sytuacyjna.</w:t>
+      </w:r>
+    </w:p>
     <w:sectPr>
       <w:pgSz w:w="11906" w:h="16838"/>
       <w:pgMar w:top="1417" w:right="1417" w:bottom="1417" w:left="1417" w:header="708" w:footer="708" w:gutter="0"/>

</xml_diff>

<commit_message>
aktualizacja FAQ - dopisanie 2 pytań
</commit_message>
<xml_diff>
--- a/Azramata_FAQ_DO_WERYFIKACJI.docx
+++ b/Azramata_FAQ_DO_WERYFIKACJI.docx
@@ -938,15 +938,7 @@
       </w:r>
       <w:r>
         <w:br/>
-        <w:t xml:space="preserve">Jeśli system wykrywa niezgodności szybciej i redukuje liczbę błędów decyzyjnych, </w:t>
-      </w:r>
-      <w:proofErr w:type="gramStart"/>
-      <w:r>
-        <w:t>znaczy</w:t>
-      </w:r>
-      <w:proofErr w:type="gramEnd"/>
-      <w:r>
-        <w:t xml:space="preserve"> że działa poprawnie.</w:t>
+        <w:t>Jeśli system wykrywa niezgodności szybciej i redukuje liczbę błędów decyzyjnych, znaczy że działa poprawnie.</w:t>
       </w:r>
     </w:p>
     <w:p>
@@ -2031,15 +2023,7 @@
         <w:t>51</w:t>
       </w:r>
       <w:r>
-        <w:t xml:space="preserve">. </w:t>
-      </w:r>
-      <w:proofErr w:type="gramStart"/>
-      <w:r>
-        <w:t>Co</w:t>
-      </w:r>
-      <w:proofErr w:type="gramEnd"/>
-      <w:r>
-        <w:t xml:space="preserve"> jeśli dane są poprawne, ale pochodzą z wrogiego źródła?</w:t>
+        <w:t>. Co jeśli dane są poprawne, ale pochodzą z wrogiego źródła?</w:t>
       </w:r>
     </w:p>
     <w:p>
@@ -2083,15 +2067,7 @@
         <w:t>52</w:t>
       </w:r>
       <w:r>
-        <w:t xml:space="preserve">. </w:t>
-      </w:r>
-      <w:proofErr w:type="gramStart"/>
-      <w:r>
-        <w:t>Co</w:t>
-      </w:r>
-      <w:proofErr w:type="gramEnd"/>
-      <w:r>
-        <w:t xml:space="preserve"> jeśli wszystkie źródła są spójne, ale dane są spóźnione czasowo?</w:t>
+        <w:t>. Co jeśli wszystkie źródła są spójne, ale dane są spóźnione czasowo?</w:t>
       </w:r>
     </w:p>
     <w:p>
@@ -2658,6 +2634,298 @@
       <w:r>
         <w:t>Rośnie świadomość sytuacyjna.</w:t>
       </w:r>
+    </w:p>
+    <w:p>
+      <w:pPr>
+        <w:pStyle w:val="Nagwek2"/>
+      </w:pPr>
+      <w:r>
+        <w:t xml:space="preserve">65. </w:t>
+      </w:r>
+      <w:r>
+        <w:t xml:space="preserve">„Jak widzi Pan proces integracji </w:t>
+      </w:r>
+      <w:proofErr w:type="spellStart"/>
+      <w:r>
+        <w:t>Azramaty</w:t>
+      </w:r>
+      <w:proofErr w:type="spellEnd"/>
+      <w:r>
+        <w:t xml:space="preserve"> z realnymi danymi operacyjnymi — krok po kroku?”</w:t>
+      </w:r>
+    </w:p>
+    <w:p>
+      <w:pPr>
+        <w:spacing w:after="0"/>
+      </w:pPr>
+      <w:r>
+        <w:t>*„Proces integracji zależy od specyfikacji i środowiska, którego jeszcze nie znam, więc nie mogę podać szczegółów.</w:t>
+      </w:r>
+      <w:r>
+        <w:br/>
+        <w:t xml:space="preserve">Natomiast mogę podać standardowy </w:t>
+      </w:r>
+      <w:proofErr w:type="spellStart"/>
+      <w:r>
+        <w:t>pipeline</w:t>
+      </w:r>
+      <w:proofErr w:type="spellEnd"/>
+      <w:r>
+        <w:t xml:space="preserve"> integracyjny:</w:t>
+      </w:r>
+    </w:p>
+    <w:p>
+      <w:pPr>
+        <w:numPr>
+          <w:ilvl w:val="0"/>
+          <w:numId w:val="153"/>
+        </w:numPr>
+        <w:spacing w:after="0"/>
+      </w:pPr>
+      <w:r>
+        <w:t xml:space="preserve">Środowisko </w:t>
+      </w:r>
+      <w:proofErr w:type="spellStart"/>
+      <w:r>
+        <w:t>sandbox</w:t>
+      </w:r>
+      <w:proofErr w:type="spellEnd"/>
+      <w:r>
+        <w:t xml:space="preserve"> z danymi syntetycznymi → weryfikacja </w:t>
+      </w:r>
+      <w:proofErr w:type="spellStart"/>
+      <w:r>
+        <w:t>kernela</w:t>
+      </w:r>
+      <w:proofErr w:type="spellEnd"/>
+      <w:r>
+        <w:t>.</w:t>
+      </w:r>
+    </w:p>
+    <w:p>
+      <w:pPr>
+        <w:numPr>
+          <w:ilvl w:val="0"/>
+          <w:numId w:val="153"/>
+        </w:numPr>
+        <w:spacing w:after="0"/>
+      </w:pPr>
+      <w:r>
+        <w:t>Integracja pasywna z realnym strumieniem danych → tylko odczyt, zero ingerencji.</w:t>
+      </w:r>
+    </w:p>
+    <w:p>
+      <w:pPr>
+        <w:numPr>
+          <w:ilvl w:val="0"/>
+          <w:numId w:val="153"/>
+        </w:numPr>
+        <w:spacing w:after="0"/>
+      </w:pPr>
+      <w:proofErr w:type="spellStart"/>
+      <w:r>
+        <w:t>Shadow-mode</w:t>
+      </w:r>
+      <w:proofErr w:type="spellEnd"/>
+      <w:r>
+        <w:t xml:space="preserve"> w sztabie → </w:t>
+      </w:r>
+      <w:proofErr w:type="spellStart"/>
+      <w:r>
+        <w:t>Azramata</w:t>
+      </w:r>
+      <w:proofErr w:type="spellEnd"/>
+      <w:r>
+        <w:t xml:space="preserve"> flaguje dane równolegle, ale nie wpływa na decyzje.</w:t>
+      </w:r>
+    </w:p>
+    <w:p>
+      <w:pPr>
+        <w:numPr>
+          <w:ilvl w:val="0"/>
+          <w:numId w:val="153"/>
+        </w:numPr>
+        <w:spacing w:after="0"/>
+      </w:pPr>
+      <w:r>
+        <w:t>Walidacja flag spójności z dowódcami → zgodność interpretacji.</w:t>
+      </w:r>
+    </w:p>
+    <w:p>
+      <w:pPr>
+        <w:numPr>
+          <w:ilvl w:val="0"/>
+          <w:numId w:val="153"/>
+        </w:numPr>
+        <w:spacing w:after="0"/>
+      </w:pPr>
+      <w:r>
+        <w:t>Wersja operacyjna — tylko jeśli wyniki są powtarzalne.</w:t>
+      </w:r>
+    </w:p>
+    <w:p>
+      <w:pPr>
+        <w:spacing w:after="0"/>
+      </w:pPr>
+      <w:r>
+        <w:t>Dopiero po poznaniu specyfikacji mogę ustawić parametry techniczne, ale procedura wygląda właśnie tak.”</w:t>
+      </w:r>
+    </w:p>
+    <w:p>
+      <w:pPr>
+        <w:pStyle w:val="Nagwek2"/>
+      </w:pPr>
+      <w:r>
+        <w:lastRenderedPageBreak/>
+        <w:t xml:space="preserve">66. </w:t>
+      </w:r>
+      <w:r>
+        <w:t xml:space="preserve">„Jak zabezpieczyć </w:t>
+      </w:r>
+      <w:proofErr w:type="spellStart"/>
+      <w:r>
+        <w:t>Azramatę</w:t>
+      </w:r>
+      <w:proofErr w:type="spellEnd"/>
+      <w:r>
+        <w:t xml:space="preserve"> przed przejęciem, manipulacją danymi lub nadużyciem przez wroga?”</w:t>
+      </w:r>
+    </w:p>
+    <w:p>
+      <w:r>
+        <w:t>„</w:t>
+      </w:r>
+      <w:proofErr w:type="spellStart"/>
+      <w:r>
+        <w:t>Azramata</w:t>
+      </w:r>
+      <w:proofErr w:type="spellEnd"/>
+      <w:r>
+        <w:t xml:space="preserve"> jest trudna do przejęcia, ponieważ sam </w:t>
+      </w:r>
+      <w:proofErr w:type="spellStart"/>
+      <w:r>
+        <w:t>kernel</w:t>
+      </w:r>
+      <w:proofErr w:type="spellEnd"/>
+      <w:r>
+        <w:t xml:space="preserve"> nie zawiera wiedzy operacyjnej — to jedynie deterministyczna logika flagowania.</w:t>
+      </w:r>
+      <w:r>
+        <w:br/>
+        <w:t>Pełna wartość systemu wynika nie z kodu, ale z zastosowania przez sztab, procedur, interpretacji i konfiguracji — tego wróg nie odtworzy bez kontekstu.</w:t>
+      </w:r>
+    </w:p>
+    <w:p>
+      <w:r>
+        <w:t>Po stronie bezpieczeństwa technicznego stosujemy trzy warstwy ochrony:</w:t>
+      </w:r>
+    </w:p>
+    <w:p>
+      <w:pPr>
+        <w:numPr>
+          <w:ilvl w:val="0"/>
+          <w:numId w:val="154"/>
+        </w:numPr>
+      </w:pPr>
+      <w:r>
+        <w:rPr>
+          <w:b/>
+          <w:bCs/>
+        </w:rPr>
+        <w:t>Separacja wersji</w:t>
+      </w:r>
+      <w:r>
+        <w:t xml:space="preserve"> — operatorzy mają odchudzoną implementację, sztab posiada pełne funkcje.</w:t>
+      </w:r>
+    </w:p>
+    <w:p>
+      <w:pPr>
+        <w:numPr>
+          <w:ilvl w:val="0"/>
+          <w:numId w:val="154"/>
+        </w:numPr>
+      </w:pPr>
+      <w:r>
+        <w:rPr>
+          <w:b/>
+          <w:bCs/>
+        </w:rPr>
+        <w:t xml:space="preserve">Podpisy kryptograficzne </w:t>
+      </w:r>
+      <w:proofErr w:type="spellStart"/>
+      <w:r>
+        <w:rPr>
+          <w:b/>
+          <w:bCs/>
+        </w:rPr>
+        <w:t>kernela</w:t>
+      </w:r>
+      <w:proofErr w:type="spellEnd"/>
+      <w:r>
+        <w:t xml:space="preserve"> — uniemożliwiają manipulację logiką flagowania.</w:t>
+      </w:r>
+    </w:p>
+    <w:p>
+      <w:pPr>
+        <w:numPr>
+          <w:ilvl w:val="0"/>
+          <w:numId w:val="154"/>
+        </w:numPr>
+      </w:pPr>
+      <w:r>
+        <w:rPr>
+          <w:b/>
+          <w:bCs/>
+        </w:rPr>
+        <w:t xml:space="preserve">Izolacja </w:t>
+      </w:r>
+      <w:proofErr w:type="spellStart"/>
+      <w:r>
+        <w:rPr>
+          <w:b/>
+          <w:bCs/>
+        </w:rPr>
+        <w:t>runtime</w:t>
+      </w:r>
+      <w:proofErr w:type="spellEnd"/>
+      <w:r>
+        <w:rPr>
+          <w:b/>
+          <w:bCs/>
+        </w:rPr>
+        <w:t xml:space="preserve"> (</w:t>
+      </w:r>
+      <w:proofErr w:type="spellStart"/>
+      <w:r>
+        <w:rPr>
+          <w:b/>
+          <w:bCs/>
+        </w:rPr>
+        <w:t>sandbox</w:t>
+      </w:r>
+      <w:proofErr w:type="spellEnd"/>
+      <w:r>
+        <w:rPr>
+          <w:b/>
+          <w:bCs/>
+        </w:rPr>
+        <w:t>)</w:t>
+      </w:r>
+      <w:r>
+        <w:t xml:space="preserve"> — moduł działa jako pasywna warstwa, bez dostępu do kluczowych systemów.</w:t>
+      </w:r>
+    </w:p>
+    <w:p>
+      <w:r>
+        <w:t>Nawet jeśli wróg przejmie kod, nie uzyska warstwy kognitywnej i procedur dowódczych, które nadają systemowi skuteczność.”</w:t>
+      </w:r>
+    </w:p>
+    <w:p/>
+    <w:p>
+      <w:pPr>
+        <w:spacing w:after="0"/>
+      </w:pPr>
     </w:p>
     <w:sectPr>
       <w:pgSz w:w="11906" w:h="16838"/>
@@ -8271,6 +8539,119 @@
     </w:lvl>
   </w:abstractNum>
   <w:abstractNum w:abstractNumId="47" w15:restartNumberingAfterBreak="0">
+    <w:nsid w:val="28DB2024"/>
+    <w:multiLevelType w:val="multilevel"/>
+    <w:tmpl w:val="87BEEB0E"/>
+    <w:lvl w:ilvl="0">
+      <w:start w:val="1"/>
+      <w:numFmt w:val="decimal"/>
+      <w:lvlText w:val="%1."/>
+      <w:lvlJc w:val="left"/>
+      <w:pPr>
+        <w:tabs>
+          <w:tab w:val="num" w:pos="720"/>
+        </w:tabs>
+        <w:ind w:left="720" w:hanging="360"/>
+      </w:pPr>
+    </w:lvl>
+    <w:lvl w:ilvl="1" w:tentative="1">
+      <w:start w:val="1"/>
+      <w:numFmt w:val="decimal"/>
+      <w:lvlText w:val="%2."/>
+      <w:lvlJc w:val="left"/>
+      <w:pPr>
+        <w:tabs>
+          <w:tab w:val="num" w:pos="1440"/>
+        </w:tabs>
+        <w:ind w:left="1440" w:hanging="360"/>
+      </w:pPr>
+    </w:lvl>
+    <w:lvl w:ilvl="2" w:tentative="1">
+      <w:start w:val="1"/>
+      <w:numFmt w:val="decimal"/>
+      <w:lvlText w:val="%3."/>
+      <w:lvlJc w:val="left"/>
+      <w:pPr>
+        <w:tabs>
+          <w:tab w:val="num" w:pos="2160"/>
+        </w:tabs>
+        <w:ind w:left="2160" w:hanging="360"/>
+      </w:pPr>
+    </w:lvl>
+    <w:lvl w:ilvl="3" w:tentative="1">
+      <w:start w:val="1"/>
+      <w:numFmt w:val="decimal"/>
+      <w:lvlText w:val="%4."/>
+      <w:lvlJc w:val="left"/>
+      <w:pPr>
+        <w:tabs>
+          <w:tab w:val="num" w:pos="2880"/>
+        </w:tabs>
+        <w:ind w:left="2880" w:hanging="360"/>
+      </w:pPr>
+    </w:lvl>
+    <w:lvl w:ilvl="4" w:tentative="1">
+      <w:start w:val="1"/>
+      <w:numFmt w:val="decimal"/>
+      <w:lvlText w:val="%5."/>
+      <w:lvlJc w:val="left"/>
+      <w:pPr>
+        <w:tabs>
+          <w:tab w:val="num" w:pos="3600"/>
+        </w:tabs>
+        <w:ind w:left="3600" w:hanging="360"/>
+      </w:pPr>
+    </w:lvl>
+    <w:lvl w:ilvl="5" w:tentative="1">
+      <w:start w:val="1"/>
+      <w:numFmt w:val="decimal"/>
+      <w:lvlText w:val="%6."/>
+      <w:lvlJc w:val="left"/>
+      <w:pPr>
+        <w:tabs>
+          <w:tab w:val="num" w:pos="4320"/>
+        </w:tabs>
+        <w:ind w:left="4320" w:hanging="360"/>
+      </w:pPr>
+    </w:lvl>
+    <w:lvl w:ilvl="6" w:tentative="1">
+      <w:start w:val="1"/>
+      <w:numFmt w:val="decimal"/>
+      <w:lvlText w:val="%7."/>
+      <w:lvlJc w:val="left"/>
+      <w:pPr>
+        <w:tabs>
+          <w:tab w:val="num" w:pos="5040"/>
+        </w:tabs>
+        <w:ind w:left="5040" w:hanging="360"/>
+      </w:pPr>
+    </w:lvl>
+    <w:lvl w:ilvl="7" w:tentative="1">
+      <w:start w:val="1"/>
+      <w:numFmt w:val="decimal"/>
+      <w:lvlText w:val="%8."/>
+      <w:lvlJc w:val="left"/>
+      <w:pPr>
+        <w:tabs>
+          <w:tab w:val="num" w:pos="5760"/>
+        </w:tabs>
+        <w:ind w:left="5760" w:hanging="360"/>
+      </w:pPr>
+    </w:lvl>
+    <w:lvl w:ilvl="8" w:tentative="1">
+      <w:start w:val="1"/>
+      <w:numFmt w:val="decimal"/>
+      <w:lvlText w:val="%9."/>
+      <w:lvlJc w:val="left"/>
+      <w:pPr>
+        <w:tabs>
+          <w:tab w:val="num" w:pos="6480"/>
+        </w:tabs>
+        <w:ind w:left="6480" w:hanging="360"/>
+      </w:pPr>
+    </w:lvl>
+  </w:abstractNum>
+  <w:abstractNum w:abstractNumId="48" w15:restartNumberingAfterBreak="0">
     <w:nsid w:val="29F4364D"/>
     <w:multiLevelType w:val="multilevel"/>
     <w:tmpl w:val="A9E41FF6"/>
@@ -8419,7 +8800,7 @@
       </w:rPr>
     </w:lvl>
   </w:abstractNum>
-  <w:abstractNum w:abstractNumId="48" w15:restartNumberingAfterBreak="0">
+  <w:abstractNum w:abstractNumId="49" w15:restartNumberingAfterBreak="0">
     <w:nsid w:val="2AAB2FA4"/>
     <w:multiLevelType w:val="hybridMultilevel"/>
     <w:tmpl w:val="E8FC8BAC"/>
@@ -8532,7 +8913,7 @@
       </w:rPr>
     </w:lvl>
   </w:abstractNum>
-  <w:abstractNum w:abstractNumId="49" w15:restartNumberingAfterBreak="0">
+  <w:abstractNum w:abstractNumId="50" w15:restartNumberingAfterBreak="0">
     <w:nsid w:val="2B17536C"/>
     <w:multiLevelType w:val="hybridMultilevel"/>
     <w:tmpl w:val="2620FDE6"/>
@@ -8645,7 +9026,7 @@
       </w:rPr>
     </w:lvl>
   </w:abstractNum>
-  <w:abstractNum w:abstractNumId="50" w15:restartNumberingAfterBreak="0">
+  <w:abstractNum w:abstractNumId="51" w15:restartNumberingAfterBreak="0">
     <w:nsid w:val="2DAC64DD"/>
     <w:multiLevelType w:val="hybridMultilevel"/>
     <w:tmpl w:val="62C80A62"/>
@@ -8758,7 +9139,7 @@
       </w:rPr>
     </w:lvl>
   </w:abstractNum>
-  <w:abstractNum w:abstractNumId="51" w15:restartNumberingAfterBreak="0">
+  <w:abstractNum w:abstractNumId="52" w15:restartNumberingAfterBreak="0">
     <w:nsid w:val="2DE73DF9"/>
     <w:multiLevelType w:val="hybridMultilevel"/>
     <w:tmpl w:val="90044C52"/>
@@ -8871,7 +9252,7 @@
       </w:rPr>
     </w:lvl>
   </w:abstractNum>
-  <w:abstractNum w:abstractNumId="52" w15:restartNumberingAfterBreak="0">
+  <w:abstractNum w:abstractNumId="53" w15:restartNumberingAfterBreak="0">
     <w:nsid w:val="2EAB143F"/>
     <w:multiLevelType w:val="hybridMultilevel"/>
     <w:tmpl w:val="CF0CB900"/>
@@ -8984,7 +9365,7 @@
       </w:rPr>
     </w:lvl>
   </w:abstractNum>
-  <w:abstractNum w:abstractNumId="53" w15:restartNumberingAfterBreak="0">
+  <w:abstractNum w:abstractNumId="54" w15:restartNumberingAfterBreak="0">
     <w:nsid w:val="2EBE585F"/>
     <w:multiLevelType w:val="hybridMultilevel"/>
     <w:tmpl w:val="0776BC84"/>
@@ -9097,7 +9478,7 @@
       </w:rPr>
     </w:lvl>
   </w:abstractNum>
-  <w:abstractNum w:abstractNumId="54" w15:restartNumberingAfterBreak="0">
+  <w:abstractNum w:abstractNumId="55" w15:restartNumberingAfterBreak="0">
     <w:nsid w:val="2EE951E9"/>
     <w:multiLevelType w:val="hybridMultilevel"/>
     <w:tmpl w:val="1B8AEF66"/>
@@ -9210,7 +9591,7 @@
       </w:rPr>
     </w:lvl>
   </w:abstractNum>
-  <w:abstractNum w:abstractNumId="55" w15:restartNumberingAfterBreak="0">
+  <w:abstractNum w:abstractNumId="56" w15:restartNumberingAfterBreak="0">
     <w:nsid w:val="2FA6201A"/>
     <w:multiLevelType w:val="hybridMultilevel"/>
     <w:tmpl w:val="7C5EA18A"/>
@@ -9323,7 +9704,7 @@
       </w:rPr>
     </w:lvl>
   </w:abstractNum>
-  <w:abstractNum w:abstractNumId="56" w15:restartNumberingAfterBreak="0">
+  <w:abstractNum w:abstractNumId="57" w15:restartNumberingAfterBreak="0">
     <w:nsid w:val="2FDE1464"/>
     <w:multiLevelType w:val="hybridMultilevel"/>
     <w:tmpl w:val="0BE8020A"/>
@@ -9436,7 +9817,7 @@
       </w:rPr>
     </w:lvl>
   </w:abstractNum>
-  <w:abstractNum w:abstractNumId="57" w15:restartNumberingAfterBreak="0">
+  <w:abstractNum w:abstractNumId="58" w15:restartNumberingAfterBreak="0">
     <w:nsid w:val="3038081F"/>
     <w:multiLevelType w:val="hybridMultilevel"/>
     <w:tmpl w:val="862A845C"/>
@@ -9549,7 +9930,7 @@
       </w:rPr>
     </w:lvl>
   </w:abstractNum>
-  <w:abstractNum w:abstractNumId="58" w15:restartNumberingAfterBreak="0">
+  <w:abstractNum w:abstractNumId="59" w15:restartNumberingAfterBreak="0">
     <w:nsid w:val="32A75E57"/>
     <w:multiLevelType w:val="multilevel"/>
     <w:tmpl w:val="02C238C0"/>
@@ -9698,7 +10079,7 @@
       </w:rPr>
     </w:lvl>
   </w:abstractNum>
-  <w:abstractNum w:abstractNumId="59" w15:restartNumberingAfterBreak="0">
+  <w:abstractNum w:abstractNumId="60" w15:restartNumberingAfterBreak="0">
     <w:nsid w:val="330A4EAD"/>
     <w:multiLevelType w:val="hybridMultilevel"/>
     <w:tmpl w:val="F37A2CB2"/>
@@ -9811,7 +10192,7 @@
       </w:rPr>
     </w:lvl>
   </w:abstractNum>
-  <w:abstractNum w:abstractNumId="60" w15:restartNumberingAfterBreak="0">
+  <w:abstractNum w:abstractNumId="61" w15:restartNumberingAfterBreak="0">
     <w:nsid w:val="34206AAA"/>
     <w:multiLevelType w:val="hybridMultilevel"/>
     <w:tmpl w:val="8824650C"/>
@@ -9924,7 +10305,7 @@
       </w:rPr>
     </w:lvl>
   </w:abstractNum>
-  <w:abstractNum w:abstractNumId="61" w15:restartNumberingAfterBreak="0">
+  <w:abstractNum w:abstractNumId="62" w15:restartNumberingAfterBreak="0">
     <w:nsid w:val="34556B02"/>
     <w:multiLevelType w:val="hybridMultilevel"/>
     <w:tmpl w:val="E05A63B4"/>
@@ -10037,7 +10418,7 @@
       </w:rPr>
     </w:lvl>
   </w:abstractNum>
-  <w:abstractNum w:abstractNumId="62" w15:restartNumberingAfterBreak="0">
+  <w:abstractNum w:abstractNumId="63" w15:restartNumberingAfterBreak="0">
     <w:nsid w:val="351823A7"/>
     <w:multiLevelType w:val="hybridMultilevel"/>
     <w:tmpl w:val="02442C38"/>
@@ -10150,7 +10531,7 @@
       </w:rPr>
     </w:lvl>
   </w:abstractNum>
-  <w:abstractNum w:abstractNumId="63" w15:restartNumberingAfterBreak="0">
+  <w:abstractNum w:abstractNumId="64" w15:restartNumberingAfterBreak="0">
     <w:nsid w:val="359017D3"/>
     <w:multiLevelType w:val="hybridMultilevel"/>
     <w:tmpl w:val="6CAEC98C"/>
@@ -10263,7 +10644,7 @@
       </w:rPr>
     </w:lvl>
   </w:abstractNum>
-  <w:abstractNum w:abstractNumId="64" w15:restartNumberingAfterBreak="0">
+  <w:abstractNum w:abstractNumId="65" w15:restartNumberingAfterBreak="0">
     <w:nsid w:val="36807FE1"/>
     <w:multiLevelType w:val="hybridMultilevel"/>
     <w:tmpl w:val="6FE29820"/>
@@ -10376,7 +10757,7 @@
       </w:rPr>
     </w:lvl>
   </w:abstractNum>
-  <w:abstractNum w:abstractNumId="65" w15:restartNumberingAfterBreak="0">
+  <w:abstractNum w:abstractNumId="66" w15:restartNumberingAfterBreak="0">
     <w:nsid w:val="373063CC"/>
     <w:multiLevelType w:val="hybridMultilevel"/>
     <w:tmpl w:val="63CE6A0C"/>
@@ -10489,7 +10870,7 @@
       </w:rPr>
     </w:lvl>
   </w:abstractNum>
-  <w:abstractNum w:abstractNumId="66" w15:restartNumberingAfterBreak="0">
+  <w:abstractNum w:abstractNumId="67" w15:restartNumberingAfterBreak="0">
     <w:nsid w:val="38EE417F"/>
     <w:multiLevelType w:val="hybridMultilevel"/>
     <w:tmpl w:val="E19CB802"/>
@@ -10602,7 +10983,7 @@
       </w:rPr>
     </w:lvl>
   </w:abstractNum>
-  <w:abstractNum w:abstractNumId="67" w15:restartNumberingAfterBreak="0">
+  <w:abstractNum w:abstractNumId="68" w15:restartNumberingAfterBreak="0">
     <w:nsid w:val="39535554"/>
     <w:multiLevelType w:val="hybridMultilevel"/>
     <w:tmpl w:val="9B74189C"/>
@@ -10715,7 +11096,7 @@
       </w:rPr>
     </w:lvl>
   </w:abstractNum>
-  <w:abstractNum w:abstractNumId="68" w15:restartNumberingAfterBreak="0">
+  <w:abstractNum w:abstractNumId="69" w15:restartNumberingAfterBreak="0">
     <w:nsid w:val="39B51161"/>
     <w:multiLevelType w:val="multilevel"/>
     <w:tmpl w:val="E62E01FC"/>
@@ -10864,7 +11245,7 @@
       </w:rPr>
     </w:lvl>
   </w:abstractNum>
-  <w:abstractNum w:abstractNumId="69" w15:restartNumberingAfterBreak="0">
+  <w:abstractNum w:abstractNumId="70" w15:restartNumberingAfterBreak="0">
     <w:nsid w:val="3B766B00"/>
     <w:multiLevelType w:val="hybridMultilevel"/>
     <w:tmpl w:val="76F282DC"/>
@@ -10977,7 +11358,7 @@
       </w:rPr>
     </w:lvl>
   </w:abstractNum>
-  <w:abstractNum w:abstractNumId="70" w15:restartNumberingAfterBreak="0">
+  <w:abstractNum w:abstractNumId="71" w15:restartNumberingAfterBreak="0">
     <w:nsid w:val="3BD7764F"/>
     <w:multiLevelType w:val="hybridMultilevel"/>
     <w:tmpl w:val="21C838B2"/>
@@ -11090,7 +11471,7 @@
       </w:rPr>
     </w:lvl>
   </w:abstractNum>
-  <w:abstractNum w:abstractNumId="71" w15:restartNumberingAfterBreak="0">
+  <w:abstractNum w:abstractNumId="72" w15:restartNumberingAfterBreak="0">
     <w:nsid w:val="3C106A78"/>
     <w:multiLevelType w:val="multilevel"/>
     <w:tmpl w:val="A738803E"/>
@@ -11239,7 +11620,7 @@
       </w:rPr>
     </w:lvl>
   </w:abstractNum>
-  <w:abstractNum w:abstractNumId="72" w15:restartNumberingAfterBreak="0">
+  <w:abstractNum w:abstractNumId="73" w15:restartNumberingAfterBreak="0">
     <w:nsid w:val="3CCF19CC"/>
     <w:multiLevelType w:val="hybridMultilevel"/>
     <w:tmpl w:val="99A86D4E"/>
@@ -11352,7 +11733,7 @@
       </w:rPr>
     </w:lvl>
   </w:abstractNum>
-  <w:abstractNum w:abstractNumId="73" w15:restartNumberingAfterBreak="0">
+  <w:abstractNum w:abstractNumId="74" w15:restartNumberingAfterBreak="0">
     <w:nsid w:val="3DB62DC6"/>
     <w:multiLevelType w:val="hybridMultilevel"/>
     <w:tmpl w:val="744ABCCE"/>
@@ -11465,7 +11846,7 @@
       </w:rPr>
     </w:lvl>
   </w:abstractNum>
-  <w:abstractNum w:abstractNumId="74" w15:restartNumberingAfterBreak="0">
+  <w:abstractNum w:abstractNumId="75" w15:restartNumberingAfterBreak="0">
     <w:nsid w:val="3DF81D8F"/>
     <w:multiLevelType w:val="hybridMultilevel"/>
     <w:tmpl w:val="5386D48E"/>
@@ -11578,7 +11959,7 @@
       </w:rPr>
     </w:lvl>
   </w:abstractNum>
-  <w:abstractNum w:abstractNumId="75" w15:restartNumberingAfterBreak="0">
+  <w:abstractNum w:abstractNumId="76" w15:restartNumberingAfterBreak="0">
     <w:nsid w:val="3EB73B0D"/>
     <w:multiLevelType w:val="hybridMultilevel"/>
     <w:tmpl w:val="3CCCC070"/>
@@ -11691,7 +12072,7 @@
       </w:rPr>
     </w:lvl>
   </w:abstractNum>
-  <w:abstractNum w:abstractNumId="76" w15:restartNumberingAfterBreak="0">
+  <w:abstractNum w:abstractNumId="77" w15:restartNumberingAfterBreak="0">
     <w:nsid w:val="3EC42B6F"/>
     <w:multiLevelType w:val="hybridMultilevel"/>
     <w:tmpl w:val="FC1EC30A"/>
@@ -11804,7 +12185,7 @@
       </w:rPr>
     </w:lvl>
   </w:abstractNum>
-  <w:abstractNum w:abstractNumId="77" w15:restartNumberingAfterBreak="0">
+  <w:abstractNum w:abstractNumId="78" w15:restartNumberingAfterBreak="0">
     <w:nsid w:val="402B6122"/>
     <w:multiLevelType w:val="hybridMultilevel"/>
     <w:tmpl w:val="482C14B4"/>
@@ -11917,7 +12298,7 @@
       </w:rPr>
     </w:lvl>
   </w:abstractNum>
-  <w:abstractNum w:abstractNumId="78" w15:restartNumberingAfterBreak="0">
+  <w:abstractNum w:abstractNumId="79" w15:restartNumberingAfterBreak="0">
     <w:nsid w:val="421318A4"/>
     <w:multiLevelType w:val="hybridMultilevel"/>
     <w:tmpl w:val="1E9811D6"/>
@@ -12030,7 +12411,7 @@
       </w:rPr>
     </w:lvl>
   </w:abstractNum>
-  <w:abstractNum w:abstractNumId="79" w15:restartNumberingAfterBreak="0">
+  <w:abstractNum w:abstractNumId="80" w15:restartNumberingAfterBreak="0">
     <w:nsid w:val="42782DAC"/>
     <w:multiLevelType w:val="hybridMultilevel"/>
     <w:tmpl w:val="9C4EE782"/>
@@ -12143,7 +12524,7 @@
       </w:rPr>
     </w:lvl>
   </w:abstractNum>
-  <w:abstractNum w:abstractNumId="80" w15:restartNumberingAfterBreak="0">
+  <w:abstractNum w:abstractNumId="81" w15:restartNumberingAfterBreak="0">
     <w:nsid w:val="429C1CCF"/>
     <w:multiLevelType w:val="hybridMultilevel"/>
     <w:tmpl w:val="C520F670"/>
@@ -12256,7 +12637,7 @@
       </w:rPr>
     </w:lvl>
   </w:abstractNum>
-  <w:abstractNum w:abstractNumId="81" w15:restartNumberingAfterBreak="0">
+  <w:abstractNum w:abstractNumId="82" w15:restartNumberingAfterBreak="0">
     <w:nsid w:val="42CD7461"/>
     <w:multiLevelType w:val="hybridMultilevel"/>
     <w:tmpl w:val="00122C1A"/>
@@ -12369,7 +12750,7 @@
       </w:rPr>
     </w:lvl>
   </w:abstractNum>
-  <w:abstractNum w:abstractNumId="82" w15:restartNumberingAfterBreak="0">
+  <w:abstractNum w:abstractNumId="83" w15:restartNumberingAfterBreak="0">
     <w:nsid w:val="43A31116"/>
     <w:multiLevelType w:val="hybridMultilevel"/>
     <w:tmpl w:val="51A0B6DA"/>
@@ -12482,7 +12863,7 @@
       </w:rPr>
     </w:lvl>
   </w:abstractNum>
-  <w:abstractNum w:abstractNumId="83" w15:restartNumberingAfterBreak="0">
+  <w:abstractNum w:abstractNumId="84" w15:restartNumberingAfterBreak="0">
     <w:nsid w:val="44720009"/>
     <w:multiLevelType w:val="multilevel"/>
     <w:tmpl w:val="2A66F598"/>
@@ -12631,7 +13012,7 @@
       </w:rPr>
     </w:lvl>
   </w:abstractNum>
-  <w:abstractNum w:abstractNumId="84" w15:restartNumberingAfterBreak="0">
+  <w:abstractNum w:abstractNumId="85" w15:restartNumberingAfterBreak="0">
     <w:nsid w:val="44D15309"/>
     <w:multiLevelType w:val="hybridMultilevel"/>
     <w:tmpl w:val="86283E3C"/>
@@ -12744,7 +13125,7 @@
       </w:rPr>
     </w:lvl>
   </w:abstractNum>
-  <w:abstractNum w:abstractNumId="85" w15:restartNumberingAfterBreak="0">
+  <w:abstractNum w:abstractNumId="86" w15:restartNumberingAfterBreak="0">
     <w:nsid w:val="46D34C6F"/>
     <w:multiLevelType w:val="hybridMultilevel"/>
     <w:tmpl w:val="28D03078"/>
@@ -12857,7 +13238,7 @@
       </w:rPr>
     </w:lvl>
   </w:abstractNum>
-  <w:abstractNum w:abstractNumId="86" w15:restartNumberingAfterBreak="0">
+  <w:abstractNum w:abstractNumId="87" w15:restartNumberingAfterBreak="0">
     <w:nsid w:val="46F14F10"/>
     <w:multiLevelType w:val="hybridMultilevel"/>
     <w:tmpl w:val="CCDE0824"/>
@@ -12970,7 +13351,7 @@
       </w:rPr>
     </w:lvl>
   </w:abstractNum>
-  <w:abstractNum w:abstractNumId="87" w15:restartNumberingAfterBreak="0">
+  <w:abstractNum w:abstractNumId="88" w15:restartNumberingAfterBreak="0">
     <w:nsid w:val="47195241"/>
     <w:multiLevelType w:val="hybridMultilevel"/>
     <w:tmpl w:val="8F1EE012"/>
@@ -13083,7 +13464,120 @@
       </w:rPr>
     </w:lvl>
   </w:abstractNum>
-  <w:abstractNum w:abstractNumId="88" w15:restartNumberingAfterBreak="0">
+  <w:abstractNum w:abstractNumId="89" w15:restartNumberingAfterBreak="0">
+    <w:nsid w:val="472A4B7A"/>
+    <w:multiLevelType w:val="multilevel"/>
+    <w:tmpl w:val="9F809AF2"/>
+    <w:lvl w:ilvl="0">
+      <w:start w:val="1"/>
+      <w:numFmt w:val="decimal"/>
+      <w:lvlText w:val="%1."/>
+      <w:lvlJc w:val="left"/>
+      <w:pPr>
+        <w:tabs>
+          <w:tab w:val="num" w:pos="720"/>
+        </w:tabs>
+        <w:ind w:left="720" w:hanging="360"/>
+      </w:pPr>
+    </w:lvl>
+    <w:lvl w:ilvl="1" w:tentative="1">
+      <w:start w:val="1"/>
+      <w:numFmt w:val="decimal"/>
+      <w:lvlText w:val="%2."/>
+      <w:lvlJc w:val="left"/>
+      <w:pPr>
+        <w:tabs>
+          <w:tab w:val="num" w:pos="1440"/>
+        </w:tabs>
+        <w:ind w:left="1440" w:hanging="360"/>
+      </w:pPr>
+    </w:lvl>
+    <w:lvl w:ilvl="2" w:tentative="1">
+      <w:start w:val="1"/>
+      <w:numFmt w:val="decimal"/>
+      <w:lvlText w:val="%3."/>
+      <w:lvlJc w:val="left"/>
+      <w:pPr>
+        <w:tabs>
+          <w:tab w:val="num" w:pos="2160"/>
+        </w:tabs>
+        <w:ind w:left="2160" w:hanging="360"/>
+      </w:pPr>
+    </w:lvl>
+    <w:lvl w:ilvl="3" w:tentative="1">
+      <w:start w:val="1"/>
+      <w:numFmt w:val="decimal"/>
+      <w:lvlText w:val="%4."/>
+      <w:lvlJc w:val="left"/>
+      <w:pPr>
+        <w:tabs>
+          <w:tab w:val="num" w:pos="2880"/>
+        </w:tabs>
+        <w:ind w:left="2880" w:hanging="360"/>
+      </w:pPr>
+    </w:lvl>
+    <w:lvl w:ilvl="4" w:tentative="1">
+      <w:start w:val="1"/>
+      <w:numFmt w:val="decimal"/>
+      <w:lvlText w:val="%5."/>
+      <w:lvlJc w:val="left"/>
+      <w:pPr>
+        <w:tabs>
+          <w:tab w:val="num" w:pos="3600"/>
+        </w:tabs>
+        <w:ind w:left="3600" w:hanging="360"/>
+      </w:pPr>
+    </w:lvl>
+    <w:lvl w:ilvl="5" w:tentative="1">
+      <w:start w:val="1"/>
+      <w:numFmt w:val="decimal"/>
+      <w:lvlText w:val="%6."/>
+      <w:lvlJc w:val="left"/>
+      <w:pPr>
+        <w:tabs>
+          <w:tab w:val="num" w:pos="4320"/>
+        </w:tabs>
+        <w:ind w:left="4320" w:hanging="360"/>
+      </w:pPr>
+    </w:lvl>
+    <w:lvl w:ilvl="6" w:tentative="1">
+      <w:start w:val="1"/>
+      <w:numFmt w:val="decimal"/>
+      <w:lvlText w:val="%7."/>
+      <w:lvlJc w:val="left"/>
+      <w:pPr>
+        <w:tabs>
+          <w:tab w:val="num" w:pos="5040"/>
+        </w:tabs>
+        <w:ind w:left="5040" w:hanging="360"/>
+      </w:pPr>
+    </w:lvl>
+    <w:lvl w:ilvl="7" w:tentative="1">
+      <w:start w:val="1"/>
+      <w:numFmt w:val="decimal"/>
+      <w:lvlText w:val="%8."/>
+      <w:lvlJc w:val="left"/>
+      <w:pPr>
+        <w:tabs>
+          <w:tab w:val="num" w:pos="5760"/>
+        </w:tabs>
+        <w:ind w:left="5760" w:hanging="360"/>
+      </w:pPr>
+    </w:lvl>
+    <w:lvl w:ilvl="8" w:tentative="1">
+      <w:start w:val="1"/>
+      <w:numFmt w:val="decimal"/>
+      <w:lvlText w:val="%9."/>
+      <w:lvlJc w:val="left"/>
+      <w:pPr>
+        <w:tabs>
+          <w:tab w:val="num" w:pos="6480"/>
+        </w:tabs>
+        <w:ind w:left="6480" w:hanging="360"/>
+      </w:pPr>
+    </w:lvl>
+  </w:abstractNum>
+  <w:abstractNum w:abstractNumId="90" w15:restartNumberingAfterBreak="0">
     <w:nsid w:val="47875AAF"/>
     <w:multiLevelType w:val="hybridMultilevel"/>
     <w:tmpl w:val="6088B238"/>
@@ -13196,7 +13690,7 @@
       </w:rPr>
     </w:lvl>
   </w:abstractNum>
-  <w:abstractNum w:abstractNumId="89" w15:restartNumberingAfterBreak="0">
+  <w:abstractNum w:abstractNumId="91" w15:restartNumberingAfterBreak="0">
     <w:nsid w:val="48B63A7C"/>
     <w:multiLevelType w:val="hybridMultilevel"/>
     <w:tmpl w:val="C94014FC"/>
@@ -13309,7 +13803,7 @@
       </w:rPr>
     </w:lvl>
   </w:abstractNum>
-  <w:abstractNum w:abstractNumId="90" w15:restartNumberingAfterBreak="0">
+  <w:abstractNum w:abstractNumId="92" w15:restartNumberingAfterBreak="0">
     <w:nsid w:val="48EA0914"/>
     <w:multiLevelType w:val="hybridMultilevel"/>
     <w:tmpl w:val="DD02481C"/>
@@ -13422,7 +13916,7 @@
       </w:rPr>
     </w:lvl>
   </w:abstractNum>
-  <w:abstractNum w:abstractNumId="91" w15:restartNumberingAfterBreak="0">
+  <w:abstractNum w:abstractNumId="93" w15:restartNumberingAfterBreak="0">
     <w:nsid w:val="4CA46C1E"/>
     <w:multiLevelType w:val="hybridMultilevel"/>
     <w:tmpl w:val="28D836FC"/>
@@ -13535,7 +14029,7 @@
       </w:rPr>
     </w:lvl>
   </w:abstractNum>
-  <w:abstractNum w:abstractNumId="92" w15:restartNumberingAfterBreak="0">
+  <w:abstractNum w:abstractNumId="94" w15:restartNumberingAfterBreak="0">
     <w:nsid w:val="4D5B51E2"/>
     <w:multiLevelType w:val="hybridMultilevel"/>
     <w:tmpl w:val="3E6C2A88"/>
@@ -13648,7 +14142,7 @@
       </w:rPr>
     </w:lvl>
   </w:abstractNum>
-  <w:abstractNum w:abstractNumId="93" w15:restartNumberingAfterBreak="0">
+  <w:abstractNum w:abstractNumId="95" w15:restartNumberingAfterBreak="0">
     <w:nsid w:val="4FAE13B7"/>
     <w:multiLevelType w:val="multilevel"/>
     <w:tmpl w:val="2E92DC62"/>
@@ -13797,7 +14291,7 @@
       </w:rPr>
     </w:lvl>
   </w:abstractNum>
-  <w:abstractNum w:abstractNumId="94" w15:restartNumberingAfterBreak="0">
+  <w:abstractNum w:abstractNumId="96" w15:restartNumberingAfterBreak="0">
     <w:nsid w:val="5140515F"/>
     <w:multiLevelType w:val="hybridMultilevel"/>
     <w:tmpl w:val="D7BE5328"/>
@@ -13910,7 +14404,7 @@
       </w:rPr>
     </w:lvl>
   </w:abstractNum>
-  <w:abstractNum w:abstractNumId="95" w15:restartNumberingAfterBreak="0">
+  <w:abstractNum w:abstractNumId="97" w15:restartNumberingAfterBreak="0">
     <w:nsid w:val="51B422E6"/>
     <w:multiLevelType w:val="hybridMultilevel"/>
     <w:tmpl w:val="290E70EE"/>
@@ -14023,7 +14517,7 @@
       </w:rPr>
     </w:lvl>
   </w:abstractNum>
-  <w:abstractNum w:abstractNumId="96" w15:restartNumberingAfterBreak="0">
+  <w:abstractNum w:abstractNumId="98" w15:restartNumberingAfterBreak="0">
     <w:nsid w:val="51BE2D8A"/>
     <w:multiLevelType w:val="hybridMultilevel"/>
     <w:tmpl w:val="A9EE97E8"/>
@@ -14136,7 +14630,7 @@
       </w:rPr>
     </w:lvl>
   </w:abstractNum>
-  <w:abstractNum w:abstractNumId="97" w15:restartNumberingAfterBreak="0">
+  <w:abstractNum w:abstractNumId="99" w15:restartNumberingAfterBreak="0">
     <w:nsid w:val="53762D60"/>
     <w:multiLevelType w:val="multilevel"/>
     <w:tmpl w:val="E248769C"/>
@@ -14285,7 +14779,7 @@
       </w:rPr>
     </w:lvl>
   </w:abstractNum>
-  <w:abstractNum w:abstractNumId="98" w15:restartNumberingAfterBreak="0">
+  <w:abstractNum w:abstractNumId="100" w15:restartNumberingAfterBreak="0">
     <w:nsid w:val="539412CC"/>
     <w:multiLevelType w:val="hybridMultilevel"/>
     <w:tmpl w:val="ADA66DFE"/>
@@ -14398,7 +14892,7 @@
       </w:rPr>
     </w:lvl>
   </w:abstractNum>
-  <w:abstractNum w:abstractNumId="99" w15:restartNumberingAfterBreak="0">
+  <w:abstractNum w:abstractNumId="101" w15:restartNumberingAfterBreak="0">
     <w:nsid w:val="540B7B0E"/>
     <w:multiLevelType w:val="hybridMultilevel"/>
     <w:tmpl w:val="58CE4CA2"/>
@@ -14511,7 +15005,7 @@
       </w:rPr>
     </w:lvl>
   </w:abstractNum>
-  <w:abstractNum w:abstractNumId="100" w15:restartNumberingAfterBreak="0">
+  <w:abstractNum w:abstractNumId="102" w15:restartNumberingAfterBreak="0">
     <w:nsid w:val="542C58B4"/>
     <w:multiLevelType w:val="hybridMultilevel"/>
     <w:tmpl w:val="8F7ABB8E"/>
@@ -14624,7 +15118,7 @@
       </w:rPr>
     </w:lvl>
   </w:abstractNum>
-  <w:abstractNum w:abstractNumId="101" w15:restartNumberingAfterBreak="0">
+  <w:abstractNum w:abstractNumId="103" w15:restartNumberingAfterBreak="0">
     <w:nsid w:val="54AA4B2C"/>
     <w:multiLevelType w:val="multilevel"/>
     <w:tmpl w:val="12E65866"/>
@@ -14773,7 +15267,7 @@
       </w:rPr>
     </w:lvl>
   </w:abstractNum>
-  <w:abstractNum w:abstractNumId="102" w15:restartNumberingAfterBreak="0">
+  <w:abstractNum w:abstractNumId="104" w15:restartNumberingAfterBreak="0">
     <w:nsid w:val="550C6930"/>
     <w:multiLevelType w:val="hybridMultilevel"/>
     <w:tmpl w:val="6C52FAE8"/>
@@ -14886,7 +15380,7 @@
       </w:rPr>
     </w:lvl>
   </w:abstractNum>
-  <w:abstractNum w:abstractNumId="103" w15:restartNumberingAfterBreak="0">
+  <w:abstractNum w:abstractNumId="105" w15:restartNumberingAfterBreak="0">
     <w:nsid w:val="55810AF3"/>
     <w:multiLevelType w:val="hybridMultilevel"/>
     <w:tmpl w:val="8C1EF9EC"/>
@@ -14999,7 +15493,7 @@
       </w:rPr>
     </w:lvl>
   </w:abstractNum>
-  <w:abstractNum w:abstractNumId="104" w15:restartNumberingAfterBreak="0">
+  <w:abstractNum w:abstractNumId="106" w15:restartNumberingAfterBreak="0">
     <w:nsid w:val="56B47BA1"/>
     <w:multiLevelType w:val="hybridMultilevel"/>
     <w:tmpl w:val="4EEADE80"/>
@@ -15112,7 +15606,7 @@
       </w:rPr>
     </w:lvl>
   </w:abstractNum>
-  <w:abstractNum w:abstractNumId="105" w15:restartNumberingAfterBreak="0">
+  <w:abstractNum w:abstractNumId="107" w15:restartNumberingAfterBreak="0">
     <w:nsid w:val="57966F88"/>
     <w:multiLevelType w:val="hybridMultilevel"/>
     <w:tmpl w:val="2326D0D8"/>
@@ -15225,7 +15719,7 @@
       </w:rPr>
     </w:lvl>
   </w:abstractNum>
-  <w:abstractNum w:abstractNumId="106" w15:restartNumberingAfterBreak="0">
+  <w:abstractNum w:abstractNumId="108" w15:restartNumberingAfterBreak="0">
     <w:nsid w:val="591C630F"/>
     <w:multiLevelType w:val="hybridMultilevel"/>
     <w:tmpl w:val="0CD6E032"/>
@@ -15338,7 +15832,7 @@
       </w:rPr>
     </w:lvl>
   </w:abstractNum>
-  <w:abstractNum w:abstractNumId="107" w15:restartNumberingAfterBreak="0">
+  <w:abstractNum w:abstractNumId="109" w15:restartNumberingAfterBreak="0">
     <w:nsid w:val="59FD0E5A"/>
     <w:multiLevelType w:val="hybridMultilevel"/>
     <w:tmpl w:val="A3C43A9A"/>
@@ -15451,7 +15945,7 @@
       </w:rPr>
     </w:lvl>
   </w:abstractNum>
-  <w:abstractNum w:abstractNumId="108" w15:restartNumberingAfterBreak="0">
+  <w:abstractNum w:abstractNumId="110" w15:restartNumberingAfterBreak="0">
     <w:nsid w:val="5B9360F1"/>
     <w:multiLevelType w:val="hybridMultilevel"/>
     <w:tmpl w:val="8B36FF92"/>
@@ -15564,7 +16058,7 @@
       </w:rPr>
     </w:lvl>
   </w:abstractNum>
-  <w:abstractNum w:abstractNumId="109" w15:restartNumberingAfterBreak="0">
+  <w:abstractNum w:abstractNumId="111" w15:restartNumberingAfterBreak="0">
     <w:nsid w:val="5C591716"/>
     <w:multiLevelType w:val="hybridMultilevel"/>
     <w:tmpl w:val="CD6E7C62"/>
@@ -15677,7 +16171,7 @@
       </w:rPr>
     </w:lvl>
   </w:abstractNum>
-  <w:abstractNum w:abstractNumId="110" w15:restartNumberingAfterBreak="0">
+  <w:abstractNum w:abstractNumId="112" w15:restartNumberingAfterBreak="0">
     <w:nsid w:val="5D8C7C90"/>
     <w:multiLevelType w:val="hybridMultilevel"/>
     <w:tmpl w:val="012E9BB2"/>
@@ -15790,7 +16284,7 @@
       </w:rPr>
     </w:lvl>
   </w:abstractNum>
-  <w:abstractNum w:abstractNumId="111" w15:restartNumberingAfterBreak="0">
+  <w:abstractNum w:abstractNumId="113" w15:restartNumberingAfterBreak="0">
     <w:nsid w:val="5FF04E53"/>
     <w:multiLevelType w:val="hybridMultilevel"/>
     <w:tmpl w:val="29D89D46"/>
@@ -15903,7 +16397,7 @@
       </w:rPr>
     </w:lvl>
   </w:abstractNum>
-  <w:abstractNum w:abstractNumId="112" w15:restartNumberingAfterBreak="0">
+  <w:abstractNum w:abstractNumId="114" w15:restartNumberingAfterBreak="0">
     <w:nsid w:val="60450406"/>
     <w:multiLevelType w:val="hybridMultilevel"/>
     <w:tmpl w:val="02BAE2E8"/>
@@ -16016,7 +16510,7 @@
       </w:rPr>
     </w:lvl>
   </w:abstractNum>
-  <w:abstractNum w:abstractNumId="113" w15:restartNumberingAfterBreak="0">
+  <w:abstractNum w:abstractNumId="115" w15:restartNumberingAfterBreak="0">
     <w:nsid w:val="60753F0B"/>
     <w:multiLevelType w:val="hybridMultilevel"/>
     <w:tmpl w:val="8BE2E23A"/>
@@ -16129,7 +16623,7 @@
       </w:rPr>
     </w:lvl>
   </w:abstractNum>
-  <w:abstractNum w:abstractNumId="114" w15:restartNumberingAfterBreak="0">
+  <w:abstractNum w:abstractNumId="116" w15:restartNumberingAfterBreak="0">
     <w:nsid w:val="61AC5811"/>
     <w:multiLevelType w:val="hybridMultilevel"/>
     <w:tmpl w:val="9006D174"/>
@@ -16242,7 +16736,7 @@
       </w:rPr>
     </w:lvl>
   </w:abstractNum>
-  <w:abstractNum w:abstractNumId="115" w15:restartNumberingAfterBreak="0">
+  <w:abstractNum w:abstractNumId="117" w15:restartNumberingAfterBreak="0">
     <w:nsid w:val="61EE452C"/>
     <w:multiLevelType w:val="multilevel"/>
     <w:tmpl w:val="B2ECBD78"/>
@@ -16391,7 +16885,7 @@
       </w:rPr>
     </w:lvl>
   </w:abstractNum>
-  <w:abstractNum w:abstractNumId="116" w15:restartNumberingAfterBreak="0">
+  <w:abstractNum w:abstractNumId="118" w15:restartNumberingAfterBreak="0">
     <w:nsid w:val="62BC114C"/>
     <w:multiLevelType w:val="hybridMultilevel"/>
     <w:tmpl w:val="8C808966"/>
@@ -16504,7 +16998,7 @@
       </w:rPr>
     </w:lvl>
   </w:abstractNum>
-  <w:abstractNum w:abstractNumId="117" w15:restartNumberingAfterBreak="0">
+  <w:abstractNum w:abstractNumId="119" w15:restartNumberingAfterBreak="0">
     <w:nsid w:val="632837DB"/>
     <w:multiLevelType w:val="hybridMultilevel"/>
     <w:tmpl w:val="F4308824"/>
@@ -16617,7 +17111,7 @@
       </w:rPr>
     </w:lvl>
   </w:abstractNum>
-  <w:abstractNum w:abstractNumId="118" w15:restartNumberingAfterBreak="0">
+  <w:abstractNum w:abstractNumId="120" w15:restartNumberingAfterBreak="0">
     <w:nsid w:val="64056026"/>
     <w:multiLevelType w:val="hybridMultilevel"/>
     <w:tmpl w:val="AC50168E"/>
@@ -16730,7 +17224,7 @@
       </w:rPr>
     </w:lvl>
   </w:abstractNum>
-  <w:abstractNum w:abstractNumId="119" w15:restartNumberingAfterBreak="0">
+  <w:abstractNum w:abstractNumId="121" w15:restartNumberingAfterBreak="0">
     <w:nsid w:val="642412D5"/>
     <w:multiLevelType w:val="multilevel"/>
     <w:tmpl w:val="6B0079D2"/>
@@ -16879,7 +17373,7 @@
       </w:rPr>
     </w:lvl>
   </w:abstractNum>
-  <w:abstractNum w:abstractNumId="120" w15:restartNumberingAfterBreak="0">
+  <w:abstractNum w:abstractNumId="122" w15:restartNumberingAfterBreak="0">
     <w:nsid w:val="66AF274A"/>
     <w:multiLevelType w:val="hybridMultilevel"/>
     <w:tmpl w:val="F2D22AFC"/>
@@ -16992,7 +17486,7 @@
       </w:rPr>
     </w:lvl>
   </w:abstractNum>
-  <w:abstractNum w:abstractNumId="121" w15:restartNumberingAfterBreak="0">
+  <w:abstractNum w:abstractNumId="123" w15:restartNumberingAfterBreak="0">
     <w:nsid w:val="677B25DB"/>
     <w:multiLevelType w:val="multilevel"/>
     <w:tmpl w:val="0868D91C"/>
@@ -17105,7 +17599,7 @@
       </w:pPr>
     </w:lvl>
   </w:abstractNum>
-  <w:abstractNum w:abstractNumId="122" w15:restartNumberingAfterBreak="0">
+  <w:abstractNum w:abstractNumId="124" w15:restartNumberingAfterBreak="0">
     <w:nsid w:val="67F9073E"/>
     <w:multiLevelType w:val="hybridMultilevel"/>
     <w:tmpl w:val="168440B2"/>
@@ -17218,7 +17712,7 @@
       </w:rPr>
     </w:lvl>
   </w:abstractNum>
-  <w:abstractNum w:abstractNumId="123" w15:restartNumberingAfterBreak="0">
+  <w:abstractNum w:abstractNumId="125" w15:restartNumberingAfterBreak="0">
     <w:nsid w:val="686117B7"/>
     <w:multiLevelType w:val="hybridMultilevel"/>
     <w:tmpl w:val="FA505D62"/>
@@ -17331,7 +17825,7 @@
       </w:rPr>
     </w:lvl>
   </w:abstractNum>
-  <w:abstractNum w:abstractNumId="124" w15:restartNumberingAfterBreak="0">
+  <w:abstractNum w:abstractNumId="126" w15:restartNumberingAfterBreak="0">
     <w:nsid w:val="6A563A63"/>
     <w:multiLevelType w:val="hybridMultilevel"/>
     <w:tmpl w:val="510479D2"/>
@@ -17444,7 +17938,7 @@
       </w:rPr>
     </w:lvl>
   </w:abstractNum>
-  <w:abstractNum w:abstractNumId="125" w15:restartNumberingAfterBreak="0">
+  <w:abstractNum w:abstractNumId="127" w15:restartNumberingAfterBreak="0">
     <w:nsid w:val="6B532302"/>
     <w:multiLevelType w:val="multilevel"/>
     <w:tmpl w:val="7CA40726"/>
@@ -17593,7 +18087,7 @@
       </w:rPr>
     </w:lvl>
   </w:abstractNum>
-  <w:abstractNum w:abstractNumId="126" w15:restartNumberingAfterBreak="0">
+  <w:abstractNum w:abstractNumId="128" w15:restartNumberingAfterBreak="0">
     <w:nsid w:val="6C821332"/>
     <w:multiLevelType w:val="hybridMultilevel"/>
     <w:tmpl w:val="52BE9B48"/>
@@ -17706,7 +18200,7 @@
       </w:rPr>
     </w:lvl>
   </w:abstractNum>
-  <w:abstractNum w:abstractNumId="127" w15:restartNumberingAfterBreak="0">
+  <w:abstractNum w:abstractNumId="129" w15:restartNumberingAfterBreak="0">
     <w:nsid w:val="6CC46A6E"/>
     <w:multiLevelType w:val="hybridMultilevel"/>
     <w:tmpl w:val="934C3E80"/>
@@ -17819,7 +18313,7 @@
       </w:rPr>
     </w:lvl>
   </w:abstractNum>
-  <w:abstractNum w:abstractNumId="128" w15:restartNumberingAfterBreak="0">
+  <w:abstractNum w:abstractNumId="130" w15:restartNumberingAfterBreak="0">
     <w:nsid w:val="6D0E08B9"/>
     <w:multiLevelType w:val="multilevel"/>
     <w:tmpl w:val="ACFCF068"/>
@@ -17968,7 +18462,7 @@
       </w:rPr>
     </w:lvl>
   </w:abstractNum>
-  <w:abstractNum w:abstractNumId="129" w15:restartNumberingAfterBreak="0">
+  <w:abstractNum w:abstractNumId="131" w15:restartNumberingAfterBreak="0">
     <w:nsid w:val="6D262B98"/>
     <w:multiLevelType w:val="hybridMultilevel"/>
     <w:tmpl w:val="5940895C"/>
@@ -18081,7 +18575,7 @@
       </w:rPr>
     </w:lvl>
   </w:abstractNum>
-  <w:abstractNum w:abstractNumId="130" w15:restartNumberingAfterBreak="0">
+  <w:abstractNum w:abstractNumId="132" w15:restartNumberingAfterBreak="0">
     <w:nsid w:val="6E1A3525"/>
     <w:multiLevelType w:val="hybridMultilevel"/>
     <w:tmpl w:val="038A0820"/>
@@ -18194,7 +18688,7 @@
       </w:rPr>
     </w:lvl>
   </w:abstractNum>
-  <w:abstractNum w:abstractNumId="131" w15:restartNumberingAfterBreak="0">
+  <w:abstractNum w:abstractNumId="133" w15:restartNumberingAfterBreak="0">
     <w:nsid w:val="6E4235B8"/>
     <w:multiLevelType w:val="hybridMultilevel"/>
     <w:tmpl w:val="3E6C2D04"/>
@@ -18307,7 +18801,7 @@
       </w:rPr>
     </w:lvl>
   </w:abstractNum>
-  <w:abstractNum w:abstractNumId="132" w15:restartNumberingAfterBreak="0">
+  <w:abstractNum w:abstractNumId="134" w15:restartNumberingAfterBreak="0">
     <w:nsid w:val="6E8649FB"/>
     <w:multiLevelType w:val="hybridMultilevel"/>
     <w:tmpl w:val="C7E66C74"/>
@@ -18420,7 +18914,7 @@
       </w:rPr>
     </w:lvl>
   </w:abstractNum>
-  <w:abstractNum w:abstractNumId="133" w15:restartNumberingAfterBreak="0">
+  <w:abstractNum w:abstractNumId="135" w15:restartNumberingAfterBreak="0">
     <w:nsid w:val="6EF50816"/>
     <w:multiLevelType w:val="hybridMultilevel"/>
     <w:tmpl w:val="C52C9FD2"/>
@@ -18533,7 +19027,7 @@
       </w:rPr>
     </w:lvl>
   </w:abstractNum>
-  <w:abstractNum w:abstractNumId="134" w15:restartNumberingAfterBreak="0">
+  <w:abstractNum w:abstractNumId="136" w15:restartNumberingAfterBreak="0">
     <w:nsid w:val="6F5C73ED"/>
     <w:multiLevelType w:val="hybridMultilevel"/>
     <w:tmpl w:val="368E2C82"/>
@@ -18646,7 +19140,7 @@
       </w:rPr>
     </w:lvl>
   </w:abstractNum>
-  <w:abstractNum w:abstractNumId="135" w15:restartNumberingAfterBreak="0">
+  <w:abstractNum w:abstractNumId="137" w15:restartNumberingAfterBreak="0">
     <w:nsid w:val="70485394"/>
     <w:multiLevelType w:val="hybridMultilevel"/>
     <w:tmpl w:val="5D9C9474"/>
@@ -18759,7 +19253,7 @@
       </w:rPr>
     </w:lvl>
   </w:abstractNum>
-  <w:abstractNum w:abstractNumId="136" w15:restartNumberingAfterBreak="0">
+  <w:abstractNum w:abstractNumId="138" w15:restartNumberingAfterBreak="0">
     <w:nsid w:val="716B7816"/>
     <w:multiLevelType w:val="hybridMultilevel"/>
     <w:tmpl w:val="887218A0"/>
@@ -18872,7 +19366,7 @@
       </w:rPr>
     </w:lvl>
   </w:abstractNum>
-  <w:abstractNum w:abstractNumId="137" w15:restartNumberingAfterBreak="0">
+  <w:abstractNum w:abstractNumId="139" w15:restartNumberingAfterBreak="0">
     <w:nsid w:val="72B272B1"/>
     <w:multiLevelType w:val="hybridMultilevel"/>
     <w:tmpl w:val="85C2D5AE"/>
@@ -18985,7 +19479,7 @@
       </w:rPr>
     </w:lvl>
   </w:abstractNum>
-  <w:abstractNum w:abstractNumId="138" w15:restartNumberingAfterBreak="0">
+  <w:abstractNum w:abstractNumId="140" w15:restartNumberingAfterBreak="0">
     <w:nsid w:val="7512093C"/>
     <w:multiLevelType w:val="multilevel"/>
     <w:tmpl w:val="01CC3222"/>
@@ -19134,7 +19628,7 @@
       </w:rPr>
     </w:lvl>
   </w:abstractNum>
-  <w:abstractNum w:abstractNumId="139" w15:restartNumberingAfterBreak="0">
+  <w:abstractNum w:abstractNumId="141" w15:restartNumberingAfterBreak="0">
     <w:nsid w:val="75EB14F0"/>
     <w:multiLevelType w:val="hybridMultilevel"/>
     <w:tmpl w:val="ECB47D42"/>
@@ -19247,7 +19741,7 @@
       </w:rPr>
     </w:lvl>
   </w:abstractNum>
-  <w:abstractNum w:abstractNumId="140" w15:restartNumberingAfterBreak="0">
+  <w:abstractNum w:abstractNumId="142" w15:restartNumberingAfterBreak="0">
     <w:nsid w:val="76270F7B"/>
     <w:multiLevelType w:val="hybridMultilevel"/>
     <w:tmpl w:val="0978AF64"/>
@@ -19360,7 +19854,7 @@
       </w:rPr>
     </w:lvl>
   </w:abstractNum>
-  <w:abstractNum w:abstractNumId="141" w15:restartNumberingAfterBreak="0">
+  <w:abstractNum w:abstractNumId="143" w15:restartNumberingAfterBreak="0">
     <w:nsid w:val="7717794D"/>
     <w:multiLevelType w:val="hybridMultilevel"/>
     <w:tmpl w:val="9ADA0E26"/>
@@ -19473,7 +19967,7 @@
       </w:rPr>
     </w:lvl>
   </w:abstractNum>
-  <w:abstractNum w:abstractNumId="142" w15:restartNumberingAfterBreak="0">
+  <w:abstractNum w:abstractNumId="144" w15:restartNumberingAfterBreak="0">
     <w:nsid w:val="7734681F"/>
     <w:multiLevelType w:val="hybridMultilevel"/>
     <w:tmpl w:val="BFB2B2EE"/>
@@ -19586,7 +20080,7 @@
       </w:rPr>
     </w:lvl>
   </w:abstractNum>
-  <w:abstractNum w:abstractNumId="143" w15:restartNumberingAfterBreak="0">
+  <w:abstractNum w:abstractNumId="145" w15:restartNumberingAfterBreak="0">
     <w:nsid w:val="77361D69"/>
     <w:multiLevelType w:val="hybridMultilevel"/>
     <w:tmpl w:val="12D4C9B0"/>
@@ -19699,7 +20193,7 @@
       </w:rPr>
     </w:lvl>
   </w:abstractNum>
-  <w:abstractNum w:abstractNumId="144" w15:restartNumberingAfterBreak="0">
+  <w:abstractNum w:abstractNumId="146" w15:restartNumberingAfterBreak="0">
     <w:nsid w:val="774F5878"/>
     <w:multiLevelType w:val="hybridMultilevel"/>
     <w:tmpl w:val="670C92FA"/>
@@ -19812,7 +20306,7 @@
       </w:rPr>
     </w:lvl>
   </w:abstractNum>
-  <w:abstractNum w:abstractNumId="145" w15:restartNumberingAfterBreak="0">
+  <w:abstractNum w:abstractNumId="147" w15:restartNumberingAfterBreak="0">
     <w:nsid w:val="78D54E05"/>
     <w:multiLevelType w:val="hybridMultilevel"/>
     <w:tmpl w:val="9E884F94"/>
@@ -19925,7 +20419,7 @@
       </w:rPr>
     </w:lvl>
   </w:abstractNum>
-  <w:abstractNum w:abstractNumId="146" w15:restartNumberingAfterBreak="0">
+  <w:abstractNum w:abstractNumId="148" w15:restartNumberingAfterBreak="0">
     <w:nsid w:val="78E12DC6"/>
     <w:multiLevelType w:val="hybridMultilevel"/>
     <w:tmpl w:val="9D36CB82"/>
@@ -20038,7 +20532,7 @@
       </w:rPr>
     </w:lvl>
   </w:abstractNum>
-  <w:abstractNum w:abstractNumId="147" w15:restartNumberingAfterBreak="0">
+  <w:abstractNum w:abstractNumId="149" w15:restartNumberingAfterBreak="0">
     <w:nsid w:val="7A6B263E"/>
     <w:multiLevelType w:val="hybridMultilevel"/>
     <w:tmpl w:val="B5028AC6"/>
@@ -20151,7 +20645,7 @@
       </w:rPr>
     </w:lvl>
   </w:abstractNum>
-  <w:abstractNum w:abstractNumId="148" w15:restartNumberingAfterBreak="0">
+  <w:abstractNum w:abstractNumId="150" w15:restartNumberingAfterBreak="0">
     <w:nsid w:val="7AFE2234"/>
     <w:multiLevelType w:val="hybridMultilevel"/>
     <w:tmpl w:val="D1903FE8"/>
@@ -20264,7 +20758,7 @@
       </w:rPr>
     </w:lvl>
   </w:abstractNum>
-  <w:abstractNum w:abstractNumId="149" w15:restartNumberingAfterBreak="0">
+  <w:abstractNum w:abstractNumId="151" w15:restartNumberingAfterBreak="0">
     <w:nsid w:val="7BC22287"/>
     <w:multiLevelType w:val="hybridMultilevel"/>
     <w:tmpl w:val="AE68598C"/>
@@ -20377,7 +20871,7 @@
       </w:rPr>
     </w:lvl>
   </w:abstractNum>
-  <w:abstractNum w:abstractNumId="150" w15:restartNumberingAfterBreak="0">
+  <w:abstractNum w:abstractNumId="152" w15:restartNumberingAfterBreak="0">
     <w:nsid w:val="7E386E72"/>
     <w:multiLevelType w:val="hybridMultilevel"/>
     <w:tmpl w:val="AAE0C428"/>
@@ -20490,7 +20984,7 @@
       </w:rPr>
     </w:lvl>
   </w:abstractNum>
-  <w:abstractNum w:abstractNumId="151" w15:restartNumberingAfterBreak="0">
+  <w:abstractNum w:abstractNumId="153" w15:restartNumberingAfterBreak="0">
     <w:nsid w:val="7E42728B"/>
     <w:multiLevelType w:val="hybridMultilevel"/>
     <w:tmpl w:val="1062F652"/>
@@ -20607,67 +21101,67 @@
     <w:abstractNumId w:val="37"/>
   </w:num>
   <w:num w:numId="2" w16cid:durableId="1658535702">
-    <w:abstractNumId w:val="127"/>
+    <w:abstractNumId w:val="129"/>
   </w:num>
   <w:num w:numId="3" w16cid:durableId="233704749">
-    <w:abstractNumId w:val="60"/>
+    <w:abstractNumId w:val="61"/>
   </w:num>
   <w:num w:numId="4" w16cid:durableId="972253654">
     <w:abstractNumId w:val="6"/>
   </w:num>
   <w:num w:numId="5" w16cid:durableId="2077899517">
-    <w:abstractNumId w:val="53"/>
+    <w:abstractNumId w:val="54"/>
   </w:num>
   <w:num w:numId="6" w16cid:durableId="1803502435">
-    <w:abstractNumId w:val="113"/>
+    <w:abstractNumId w:val="115"/>
   </w:num>
   <w:num w:numId="7" w16cid:durableId="1683512464">
-    <w:abstractNumId w:val="90"/>
+    <w:abstractNumId w:val="92"/>
   </w:num>
   <w:num w:numId="8" w16cid:durableId="166287956">
     <w:abstractNumId w:val="41"/>
   </w:num>
   <w:num w:numId="9" w16cid:durableId="1229072003">
-    <w:abstractNumId w:val="67"/>
+    <w:abstractNumId w:val="68"/>
   </w:num>
   <w:num w:numId="10" w16cid:durableId="733505122">
     <w:abstractNumId w:val="11"/>
   </w:num>
   <w:num w:numId="11" w16cid:durableId="1786580765">
-    <w:abstractNumId w:val="132"/>
+    <w:abstractNumId w:val="134"/>
   </w:num>
   <w:num w:numId="12" w16cid:durableId="235408899">
-    <w:abstractNumId w:val="72"/>
+    <w:abstractNumId w:val="73"/>
   </w:num>
   <w:num w:numId="13" w16cid:durableId="1072463132">
-    <w:abstractNumId w:val="134"/>
+    <w:abstractNumId w:val="136"/>
   </w:num>
   <w:num w:numId="14" w16cid:durableId="951088231">
-    <w:abstractNumId w:val="107"/>
+    <w:abstractNumId w:val="109"/>
   </w:num>
   <w:num w:numId="15" w16cid:durableId="1710446627">
-    <w:abstractNumId w:val="145"/>
+    <w:abstractNumId w:val="147"/>
   </w:num>
   <w:num w:numId="16" w16cid:durableId="157382402">
-    <w:abstractNumId w:val="110"/>
+    <w:abstractNumId w:val="112"/>
   </w:num>
   <w:num w:numId="17" w16cid:durableId="1408460873">
     <w:abstractNumId w:val="21"/>
   </w:num>
   <w:num w:numId="18" w16cid:durableId="1470631568">
-    <w:abstractNumId w:val="111"/>
+    <w:abstractNumId w:val="113"/>
   </w:num>
   <w:num w:numId="19" w16cid:durableId="980770489">
     <w:abstractNumId w:val="30"/>
   </w:num>
   <w:num w:numId="20" w16cid:durableId="255868751">
-    <w:abstractNumId w:val="150"/>
+    <w:abstractNumId w:val="152"/>
   </w:num>
   <w:num w:numId="21" w16cid:durableId="988821643">
-    <w:abstractNumId w:val="108"/>
+    <w:abstractNumId w:val="110"/>
   </w:num>
   <w:num w:numId="22" w16cid:durableId="1345399118">
-    <w:abstractNumId w:val="82"/>
+    <w:abstractNumId w:val="83"/>
   </w:num>
   <w:num w:numId="23" w16cid:durableId="750541389">
     <w:abstractNumId w:val="19"/>
@@ -20676,31 +21170,31 @@
     <w:abstractNumId w:val="16"/>
   </w:num>
   <w:num w:numId="25" w16cid:durableId="634071224">
-    <w:abstractNumId w:val="98"/>
+    <w:abstractNumId w:val="100"/>
   </w:num>
   <w:num w:numId="26" w16cid:durableId="446510864">
     <w:abstractNumId w:val="27"/>
   </w:num>
   <w:num w:numId="27" w16cid:durableId="1700469703">
-    <w:abstractNumId w:val="91"/>
+    <w:abstractNumId w:val="93"/>
   </w:num>
   <w:num w:numId="28" w16cid:durableId="34164917">
     <w:abstractNumId w:val="5"/>
   </w:num>
   <w:num w:numId="29" w16cid:durableId="2077631476">
-    <w:abstractNumId w:val="151"/>
+    <w:abstractNumId w:val="153"/>
   </w:num>
   <w:num w:numId="30" w16cid:durableId="593562139">
-    <w:abstractNumId w:val="96"/>
+    <w:abstractNumId w:val="98"/>
   </w:num>
   <w:num w:numId="31" w16cid:durableId="1073236225">
-    <w:abstractNumId w:val="136"/>
+    <w:abstractNumId w:val="138"/>
   </w:num>
   <w:num w:numId="32" w16cid:durableId="71632189">
-    <w:abstractNumId w:val="51"/>
+    <w:abstractNumId w:val="52"/>
   </w:num>
   <w:num w:numId="33" w16cid:durableId="455760306">
-    <w:abstractNumId w:val="75"/>
+    <w:abstractNumId w:val="76"/>
   </w:num>
   <w:num w:numId="34" w16cid:durableId="1418557715">
     <w:abstractNumId w:val="26"/>
@@ -20709,28 +21203,28 @@
     <w:abstractNumId w:val="0"/>
   </w:num>
   <w:num w:numId="36" w16cid:durableId="1982809011">
-    <w:abstractNumId w:val="131"/>
+    <w:abstractNumId w:val="133"/>
   </w:num>
   <w:num w:numId="37" w16cid:durableId="2106413905">
     <w:abstractNumId w:val="2"/>
   </w:num>
   <w:num w:numId="38" w16cid:durableId="1543400773">
-    <w:abstractNumId w:val="89"/>
+    <w:abstractNumId w:val="91"/>
   </w:num>
   <w:num w:numId="39" w16cid:durableId="562521990">
-    <w:abstractNumId w:val="103"/>
+    <w:abstractNumId w:val="105"/>
   </w:num>
   <w:num w:numId="40" w16cid:durableId="580261907">
-    <w:abstractNumId w:val="105"/>
+    <w:abstractNumId w:val="107"/>
   </w:num>
   <w:num w:numId="41" w16cid:durableId="1685473556">
-    <w:abstractNumId w:val="66"/>
+    <w:abstractNumId w:val="67"/>
   </w:num>
   <w:num w:numId="42" w16cid:durableId="182935247">
-    <w:abstractNumId w:val="148"/>
+    <w:abstractNumId w:val="150"/>
   </w:num>
   <w:num w:numId="43" w16cid:durableId="1251352316">
-    <w:abstractNumId w:val="126"/>
+    <w:abstractNumId w:val="128"/>
   </w:num>
   <w:num w:numId="44" w16cid:durableId="1978755258">
     <w:abstractNumId w:val="1"/>
@@ -20739,49 +21233,49 @@
     <w:abstractNumId w:val="4"/>
   </w:num>
   <w:num w:numId="46" w16cid:durableId="1606306916">
-    <w:abstractNumId w:val="99"/>
+    <w:abstractNumId w:val="101"/>
   </w:num>
   <w:num w:numId="47" w16cid:durableId="1600798478">
-    <w:abstractNumId w:val="73"/>
+    <w:abstractNumId w:val="74"/>
   </w:num>
   <w:num w:numId="48" w16cid:durableId="890385929">
-    <w:abstractNumId w:val="64"/>
+    <w:abstractNumId w:val="65"/>
   </w:num>
   <w:num w:numId="49" w16cid:durableId="1610896720">
-    <w:abstractNumId w:val="54"/>
+    <w:abstractNumId w:val="55"/>
   </w:num>
   <w:num w:numId="50" w16cid:durableId="377701932">
-    <w:abstractNumId w:val="94"/>
+    <w:abstractNumId w:val="96"/>
   </w:num>
   <w:num w:numId="51" w16cid:durableId="1630160765">
-    <w:abstractNumId w:val="76"/>
+    <w:abstractNumId w:val="77"/>
   </w:num>
   <w:num w:numId="52" w16cid:durableId="509295320">
     <w:abstractNumId w:val="39"/>
   </w:num>
   <w:num w:numId="53" w16cid:durableId="888344074">
-    <w:abstractNumId w:val="74"/>
+    <w:abstractNumId w:val="75"/>
   </w:num>
   <w:num w:numId="54" w16cid:durableId="899749157">
-    <w:abstractNumId w:val="118"/>
+    <w:abstractNumId w:val="120"/>
   </w:num>
   <w:num w:numId="55" w16cid:durableId="831143247">
-    <w:abstractNumId w:val="79"/>
+    <w:abstractNumId w:val="80"/>
   </w:num>
   <w:num w:numId="56" w16cid:durableId="1125007060">
     <w:abstractNumId w:val="20"/>
   </w:num>
   <w:num w:numId="57" w16cid:durableId="1905413207">
-    <w:abstractNumId w:val="133"/>
+    <w:abstractNumId w:val="135"/>
   </w:num>
   <w:num w:numId="58" w16cid:durableId="1175222795">
-    <w:abstractNumId w:val="78"/>
+    <w:abstractNumId w:val="79"/>
   </w:num>
   <w:num w:numId="59" w16cid:durableId="13195613">
     <w:abstractNumId w:val="25"/>
   </w:num>
   <w:num w:numId="60" w16cid:durableId="783158218">
-    <w:abstractNumId w:val="146"/>
+    <w:abstractNumId w:val="148"/>
   </w:num>
   <w:num w:numId="61" w16cid:durableId="1338002821">
     <w:abstractNumId w:val="43"/>
@@ -20790,10 +21284,10 @@
     <w:abstractNumId w:val="12"/>
   </w:num>
   <w:num w:numId="63" w16cid:durableId="1047031462">
-    <w:abstractNumId w:val="61"/>
+    <w:abstractNumId w:val="62"/>
   </w:num>
   <w:num w:numId="64" w16cid:durableId="1520192482">
-    <w:abstractNumId w:val="137"/>
+    <w:abstractNumId w:val="139"/>
   </w:num>
   <w:num w:numId="65" w16cid:durableId="932082008">
     <w:abstractNumId w:val="24"/>
@@ -20802,82 +21296,82 @@
     <w:abstractNumId w:val="15"/>
   </w:num>
   <w:num w:numId="67" w16cid:durableId="798760502">
-    <w:abstractNumId w:val="84"/>
+    <w:abstractNumId w:val="85"/>
   </w:num>
   <w:num w:numId="68" w16cid:durableId="1565993096">
     <w:abstractNumId w:val="32"/>
   </w:num>
   <w:num w:numId="69" w16cid:durableId="1193885105">
-    <w:abstractNumId w:val="135"/>
+    <w:abstractNumId w:val="137"/>
   </w:num>
   <w:num w:numId="70" w16cid:durableId="1334143732">
-    <w:abstractNumId w:val="122"/>
+    <w:abstractNumId w:val="124"/>
   </w:num>
   <w:num w:numId="71" w16cid:durableId="654072645">
-    <w:abstractNumId w:val="65"/>
+    <w:abstractNumId w:val="66"/>
   </w:num>
   <w:num w:numId="72" w16cid:durableId="629630023">
-    <w:abstractNumId w:val="88"/>
+    <w:abstractNumId w:val="90"/>
   </w:num>
   <w:num w:numId="73" w16cid:durableId="1071580692">
-    <w:abstractNumId w:val="95"/>
+    <w:abstractNumId w:val="97"/>
   </w:num>
   <w:num w:numId="74" w16cid:durableId="517232718">
-    <w:abstractNumId w:val="120"/>
+    <w:abstractNumId w:val="122"/>
   </w:num>
   <w:num w:numId="75" w16cid:durableId="2022584819">
     <w:abstractNumId w:val="7"/>
   </w:num>
   <w:num w:numId="76" w16cid:durableId="2044359153">
-    <w:abstractNumId w:val="143"/>
+    <w:abstractNumId w:val="145"/>
   </w:num>
   <w:num w:numId="77" w16cid:durableId="130098403">
-    <w:abstractNumId w:val="117"/>
+    <w:abstractNumId w:val="119"/>
   </w:num>
   <w:num w:numId="78" w16cid:durableId="330255475">
-    <w:abstractNumId w:val="50"/>
+    <w:abstractNumId w:val="51"/>
   </w:num>
   <w:num w:numId="79" w16cid:durableId="386027920">
-    <w:abstractNumId w:val="86"/>
+    <w:abstractNumId w:val="87"/>
   </w:num>
   <w:num w:numId="80" w16cid:durableId="945774340">
-    <w:abstractNumId w:val="142"/>
+    <w:abstractNumId w:val="144"/>
   </w:num>
   <w:num w:numId="81" w16cid:durableId="1939176006">
-    <w:abstractNumId w:val="59"/>
+    <w:abstractNumId w:val="60"/>
   </w:num>
   <w:num w:numId="82" w16cid:durableId="604776449">
-    <w:abstractNumId w:val="123"/>
+    <w:abstractNumId w:val="125"/>
   </w:num>
   <w:num w:numId="83" w16cid:durableId="1337687184">
-    <w:abstractNumId w:val="114"/>
+    <w:abstractNumId w:val="116"/>
   </w:num>
   <w:num w:numId="84" w16cid:durableId="2036079165">
-    <w:abstractNumId w:val="106"/>
+    <w:abstractNumId w:val="108"/>
   </w:num>
   <w:num w:numId="85" w16cid:durableId="2038122627">
-    <w:abstractNumId w:val="147"/>
+    <w:abstractNumId w:val="149"/>
   </w:num>
   <w:num w:numId="86" w16cid:durableId="481654517">
-    <w:abstractNumId w:val="109"/>
+    <w:abstractNumId w:val="111"/>
   </w:num>
   <w:num w:numId="87" w16cid:durableId="692070806">
     <w:abstractNumId w:val="44"/>
   </w:num>
   <w:num w:numId="88" w16cid:durableId="1591038752">
-    <w:abstractNumId w:val="81"/>
+    <w:abstractNumId w:val="82"/>
   </w:num>
   <w:num w:numId="89" w16cid:durableId="161703076">
-    <w:abstractNumId w:val="87"/>
+    <w:abstractNumId w:val="88"/>
   </w:num>
   <w:num w:numId="90" w16cid:durableId="1394085162">
-    <w:abstractNumId w:val="49"/>
+    <w:abstractNumId w:val="50"/>
   </w:num>
   <w:num w:numId="91" w16cid:durableId="1138572469">
     <w:abstractNumId w:val="38"/>
   </w:num>
   <w:num w:numId="92" w16cid:durableId="793333190">
-    <w:abstractNumId w:val="140"/>
+    <w:abstractNumId w:val="142"/>
   </w:num>
   <w:num w:numId="93" w16cid:durableId="238714378">
     <w:abstractNumId w:val="28"/>
@@ -20886,10 +21380,10 @@
     <w:abstractNumId w:val="22"/>
   </w:num>
   <w:num w:numId="95" w16cid:durableId="1389722270">
-    <w:abstractNumId w:val="92"/>
+    <w:abstractNumId w:val="94"/>
   </w:num>
   <w:num w:numId="96" w16cid:durableId="1514299669">
-    <w:abstractNumId w:val="57"/>
+    <w:abstractNumId w:val="58"/>
   </w:num>
   <w:num w:numId="97" w16cid:durableId="801383085">
     <w:abstractNumId w:val="14"/>
@@ -20901,49 +21395,49 @@
     <w:abstractNumId w:val="10"/>
   </w:num>
   <w:num w:numId="100" w16cid:durableId="1299336356">
-    <w:abstractNumId w:val="144"/>
+    <w:abstractNumId w:val="146"/>
   </w:num>
   <w:num w:numId="101" w16cid:durableId="568420418">
-    <w:abstractNumId w:val="124"/>
+    <w:abstractNumId w:val="126"/>
   </w:num>
   <w:num w:numId="102" w16cid:durableId="1706173626">
-    <w:abstractNumId w:val="55"/>
+    <w:abstractNumId w:val="56"/>
   </w:num>
   <w:num w:numId="103" w16cid:durableId="1003048439">
-    <w:abstractNumId w:val="56"/>
+    <w:abstractNumId w:val="57"/>
   </w:num>
   <w:num w:numId="104" w16cid:durableId="1637906564">
     <w:abstractNumId w:val="36"/>
   </w:num>
   <w:num w:numId="105" w16cid:durableId="1605843821">
-    <w:abstractNumId w:val="141"/>
+    <w:abstractNumId w:val="143"/>
   </w:num>
   <w:num w:numId="106" w16cid:durableId="1332679130">
-    <w:abstractNumId w:val="149"/>
+    <w:abstractNumId w:val="151"/>
   </w:num>
   <w:num w:numId="107" w16cid:durableId="1440757898">
-    <w:abstractNumId w:val="77"/>
+    <w:abstractNumId w:val="78"/>
   </w:num>
   <w:num w:numId="108" w16cid:durableId="1866216297">
     <w:abstractNumId w:val="3"/>
   </w:num>
   <w:num w:numId="109" w16cid:durableId="152844336">
-    <w:abstractNumId w:val="102"/>
+    <w:abstractNumId w:val="104"/>
   </w:num>
   <w:num w:numId="110" w16cid:durableId="1239554162">
-    <w:abstractNumId w:val="139"/>
+    <w:abstractNumId w:val="141"/>
   </w:num>
   <w:num w:numId="111" w16cid:durableId="1154879359">
-    <w:abstractNumId w:val="62"/>
+    <w:abstractNumId w:val="63"/>
   </w:num>
   <w:num w:numId="112" w16cid:durableId="2023430831">
-    <w:abstractNumId w:val="116"/>
+    <w:abstractNumId w:val="118"/>
   </w:num>
   <w:num w:numId="113" w16cid:durableId="588737421">
-    <w:abstractNumId w:val="80"/>
+    <w:abstractNumId w:val="81"/>
   </w:num>
   <w:num w:numId="114" w16cid:durableId="1194922466">
-    <w:abstractNumId w:val="52"/>
+    <w:abstractNumId w:val="53"/>
   </w:num>
   <w:num w:numId="115" w16cid:durableId="899629036">
     <w:abstractNumId w:val="13"/>
@@ -20955,22 +21449,22 @@
     <w:abstractNumId w:val="33"/>
   </w:num>
   <w:num w:numId="118" w16cid:durableId="1663898043">
-    <w:abstractNumId w:val="104"/>
+    <w:abstractNumId w:val="106"/>
   </w:num>
   <w:num w:numId="119" w16cid:durableId="1403869909">
-    <w:abstractNumId w:val="112"/>
+    <w:abstractNumId w:val="114"/>
   </w:num>
   <w:num w:numId="120" w16cid:durableId="1008218664">
-    <w:abstractNumId w:val="100"/>
+    <w:abstractNumId w:val="102"/>
   </w:num>
   <w:num w:numId="121" w16cid:durableId="1797678594">
     <w:abstractNumId w:val="34"/>
   </w:num>
   <w:num w:numId="122" w16cid:durableId="1317102473">
-    <w:abstractNumId w:val="70"/>
+    <w:abstractNumId w:val="71"/>
   </w:num>
   <w:num w:numId="123" w16cid:durableId="1610893115">
-    <w:abstractNumId w:val="129"/>
+    <w:abstractNumId w:val="131"/>
   </w:num>
   <w:num w:numId="124" w16cid:durableId="703554086">
     <w:abstractNumId w:val="17"/>
@@ -20979,7 +21473,7 @@
     <w:abstractNumId w:val="40"/>
   </w:num>
   <w:num w:numId="126" w16cid:durableId="1626740533">
-    <w:abstractNumId w:val="97"/>
+    <w:abstractNumId w:val="99"/>
   </w:num>
   <w:num w:numId="127" w16cid:durableId="999305513">
     <w:abstractNumId w:val="9"/>
@@ -20988,19 +21482,19 @@
     <w:abstractNumId w:val="46"/>
   </w:num>
   <w:num w:numId="129" w16cid:durableId="1020397803">
-    <w:abstractNumId w:val="125"/>
+    <w:abstractNumId w:val="127"/>
   </w:num>
   <w:num w:numId="130" w16cid:durableId="1327975186">
-    <w:abstractNumId w:val="101"/>
+    <w:abstractNumId w:val="103"/>
   </w:num>
   <w:num w:numId="131" w16cid:durableId="977417606">
-    <w:abstractNumId w:val="58"/>
+    <w:abstractNumId w:val="59"/>
   </w:num>
   <w:num w:numId="132" w16cid:durableId="982737219">
     <w:abstractNumId w:val="23"/>
   </w:num>
   <w:num w:numId="133" w16cid:durableId="876309636">
-    <w:abstractNumId w:val="85"/>
+    <w:abstractNumId w:val="86"/>
   </w:num>
   <w:num w:numId="134" w16cid:durableId="862135608">
     <w:abstractNumId w:val="31"/>
@@ -21009,55 +21503,61 @@
     <w:abstractNumId w:val="42"/>
   </w:num>
   <w:num w:numId="136" w16cid:durableId="356589385">
-    <w:abstractNumId w:val="130"/>
+    <w:abstractNumId w:val="132"/>
   </w:num>
   <w:num w:numId="137" w16cid:durableId="909508989">
-    <w:abstractNumId w:val="63"/>
+    <w:abstractNumId w:val="64"/>
   </w:num>
   <w:num w:numId="138" w16cid:durableId="1164928943">
     <w:abstractNumId w:val="18"/>
   </w:num>
   <w:num w:numId="139" w16cid:durableId="1522163242">
-    <w:abstractNumId w:val="121"/>
+    <w:abstractNumId w:val="123"/>
   </w:num>
   <w:num w:numId="140" w16cid:durableId="1108892760">
-    <w:abstractNumId w:val="47"/>
+    <w:abstractNumId w:val="48"/>
   </w:num>
   <w:num w:numId="141" w16cid:durableId="1632200260">
-    <w:abstractNumId w:val="138"/>
+    <w:abstractNumId w:val="140"/>
   </w:num>
   <w:num w:numId="142" w16cid:durableId="271011871">
-    <w:abstractNumId w:val="115"/>
+    <w:abstractNumId w:val="117"/>
   </w:num>
   <w:num w:numId="143" w16cid:durableId="1825925912">
     <w:abstractNumId w:val="8"/>
   </w:num>
   <w:num w:numId="144" w16cid:durableId="851988874">
-    <w:abstractNumId w:val="68"/>
+    <w:abstractNumId w:val="69"/>
   </w:num>
   <w:num w:numId="145" w16cid:durableId="327682036">
     <w:abstractNumId w:val="29"/>
   </w:num>
   <w:num w:numId="146" w16cid:durableId="417675519">
-    <w:abstractNumId w:val="71"/>
+    <w:abstractNumId w:val="72"/>
   </w:num>
   <w:num w:numId="147" w16cid:durableId="551696343">
-    <w:abstractNumId w:val="93"/>
+    <w:abstractNumId w:val="95"/>
   </w:num>
   <w:num w:numId="148" w16cid:durableId="651952360">
-    <w:abstractNumId w:val="128"/>
+    <w:abstractNumId w:val="130"/>
   </w:num>
   <w:num w:numId="149" w16cid:durableId="2111656216">
-    <w:abstractNumId w:val="119"/>
+    <w:abstractNumId w:val="121"/>
   </w:num>
   <w:num w:numId="150" w16cid:durableId="938753514">
-    <w:abstractNumId w:val="83"/>
+    <w:abstractNumId w:val="84"/>
   </w:num>
   <w:num w:numId="151" w16cid:durableId="1895846668">
-    <w:abstractNumId w:val="69"/>
+    <w:abstractNumId w:val="70"/>
   </w:num>
   <w:num w:numId="152" w16cid:durableId="115178114">
-    <w:abstractNumId w:val="48"/>
+    <w:abstractNumId w:val="49"/>
+  </w:num>
+  <w:num w:numId="153" w16cid:durableId="539627903">
+    <w:abstractNumId w:val="47"/>
+  </w:num>
+  <w:num w:numId="154" w16cid:durableId="1311863120">
+    <w:abstractNumId w:val="89"/>
   </w:num>
 </w:numbering>
 </file>

</xml_diff>